<commit_message>
Copy story issue fixed
</commit_message>
<xml_diff>
--- a/frontend/public/documentation/GoodPracticesForAutomatedTests.docx
+++ b/frontend/public/documentation/GoodPracticesForAutomatedTests.docx
@@ -1,6 +1,6 @@
 
 <file path=word/document.xml><?xml version="1.0" encoding="utf-8"?>
-<w:document xmlns:wpc="http://schemas.microsoft.com/office/word/2010/wordprocessingCanvas" xmlns:cx="http://schemas.microsoft.com/office/drawing/2014/chartex" xmlns:mc="http://schemas.openxmlformats.org/markup-compatibility/2006" xmlns:o="urn:schemas-microsoft-com:office:office" xmlns:r="http://schemas.openxmlformats.org/officeDocument/2006/relationships" xmlns:m="http://schemas.openxmlformats.org/officeDocument/2006/math" xmlns:v="urn:schemas-microsoft-com:vml" xmlns:wp14="http://schemas.microsoft.com/office/word/2010/wordprocessingDrawing" xmlns:wp="http://schemas.openxmlformats.org/drawingml/2006/wordprocessingDrawing" xmlns:w10="urn:schemas-microsoft-com:office:word" xmlns:w="http://schemas.openxmlformats.org/wordprocessingml/2006/main" xmlns:w14="http://schemas.microsoft.com/office/word/2010/wordml" xmlns:w15="http://schemas.microsoft.com/office/word/2012/wordml" xmlns:w16se="http://schemas.microsoft.com/office/word/2015/wordml/symex" xmlns:wpg="http://schemas.microsoft.com/office/word/2010/wordprocessingGroup" xmlns:wpi="http://schemas.microsoft.com/office/word/2010/wordprocessingInk" xmlns:wne="http://schemas.microsoft.com/office/word/2006/wordml" xmlns:wps="http://schemas.microsoft.com/office/word/2010/wordprocessingShape" mc:Ignorable="w14 w15 w16se wp14">
+<w:document xmlns:wpc="http://schemas.microsoft.com/office/word/2010/wordprocessingCanvas" xmlns:cx="http://schemas.microsoft.com/office/drawing/2014/chartex" xmlns:cx1="http://schemas.microsoft.com/office/drawing/2015/9/8/chartex" xmlns:cx2="http://schemas.microsoft.com/office/drawing/2015/10/21/chartex" xmlns:cx3="http://schemas.microsoft.com/office/drawing/2016/5/9/chartex" xmlns:cx4="http://schemas.microsoft.com/office/drawing/2016/5/10/chartex" xmlns:cx5="http://schemas.microsoft.com/office/drawing/2016/5/11/chartex" xmlns:cx6="http://schemas.microsoft.com/office/drawing/2016/5/12/chartex" xmlns:cx7="http://schemas.microsoft.com/office/drawing/2016/5/13/chartex" xmlns:cx8="http://schemas.microsoft.com/office/drawing/2016/5/14/chartex" xmlns:mc="http://schemas.openxmlformats.org/markup-compatibility/2006" xmlns:aink="http://schemas.microsoft.com/office/drawing/2016/ink" xmlns:am3d="http://schemas.microsoft.com/office/drawing/2017/model3d" xmlns:o="urn:schemas-microsoft-com:office:office" xmlns:oel="http://schemas.microsoft.com/office/2019/extlst" xmlns:r="http://schemas.openxmlformats.org/officeDocument/2006/relationships" xmlns:m="http://schemas.openxmlformats.org/officeDocument/2006/math" xmlns:v="urn:schemas-microsoft-com:vml" xmlns:wp14="http://schemas.microsoft.com/office/word/2010/wordprocessingDrawing" xmlns:wp="http://schemas.openxmlformats.org/drawingml/2006/wordprocessingDrawing" xmlns:w10="urn:schemas-microsoft-com:office:word" xmlns:w="http://schemas.openxmlformats.org/wordprocessingml/2006/main" xmlns:w14="http://schemas.microsoft.com/office/word/2010/wordml" xmlns:w15="http://schemas.microsoft.com/office/word/2012/wordml" xmlns:w16cex="http://schemas.microsoft.com/office/word/2018/wordml/cex" xmlns:w16cid="http://schemas.microsoft.com/office/word/2016/wordml/cid" xmlns:w16="http://schemas.microsoft.com/office/word/2018/wordml" xmlns:w16du="http://schemas.microsoft.com/office/word/2023/wordml/word16du" xmlns:w16sdtdh="http://schemas.microsoft.com/office/word/2020/wordml/sdtdatahash" xmlns:w16sdtfl="http://schemas.microsoft.com/office/word/2024/wordml/sdtformatlock" xmlns:w16se="http://schemas.microsoft.com/office/word/2015/wordml/symex" xmlns:wpg="http://schemas.microsoft.com/office/word/2010/wordprocessingGroup" xmlns:wpi="http://schemas.microsoft.com/office/word/2010/wordprocessingInk" xmlns:wne="http://schemas.microsoft.com/office/word/2006/wordml" xmlns:wps="http://schemas.microsoft.com/office/word/2010/wordprocessingShape" mc:Ignorable="w14 w15 w16se w16cid w16 w16cex w16sdtdh w16sdtfl w16du wp14">
   <w:body>
     <w:tbl>
       <w:tblPr>
@@ -140,7 +140,7 @@
                 <w:lang w:val="en-IE" w:eastAsia="en-IE"/>
               </w:rPr>
               <w:drawing>
-                <wp:inline distT="0" distB="0" distL="0" distR="0" wp14:anchorId="4D5D7051" wp14:editId="2CAE974C">
+                <wp:inline distT="0" distB="0" distL="0" distR="0" wp14:anchorId="4D5D7051" wp14:editId="00FB9521">
                   <wp:extent cx="4476584" cy="4472280"/>
                   <wp:effectExtent l="0" t="0" r="1905" b="6350"/>
                   <wp:docPr id="26" name="Picture 26"/>
@@ -396,12 +396,14 @@
           <w:lang w:val="en-GB"/>
         </w:rPr>
       </w:pPr>
+      <w:bookmarkStart w:id="0" w:name="_Toc224222354"/>
       <w:r>
         <w:rPr>
           <w:lang w:val="en-GB"/>
         </w:rPr>
         <w:t>Foreword</w:t>
       </w:r>
+      <w:bookmarkEnd w:id="0"/>
     </w:p>
     <w:p>
       <w:pPr>
@@ -606,16 +608,8 @@
         <w:rPr>
           <w:lang w:val="en-GB"/>
         </w:rPr>
-        <w:t>Naming convention can be a mix @</w:t>
-      </w:r>
-      <w:proofErr w:type="spellStart"/>
-      <w:r>
-        <w:rPr>
-          <w:lang w:val="en-GB"/>
-        </w:rPr>
-        <w:t>URL_Acceptance</w:t>
-      </w:r>
-      <w:proofErr w:type="spellEnd"/>
+        <w:t>Naming convention can be a mix @URL_Acceptance</w:t>
+      </w:r>
     </w:p>
     <w:p>
       <w:pPr>
@@ -633,22 +627,1181 @@
         <w:rPr>
           <w:lang w:val="en-GB"/>
         </w:rPr>
-        <w:t>Naming convention can be with spaces or not: @</w:t>
-      </w:r>
-      <w:proofErr w:type="spellStart"/>
-      <w:r>
-        <w:rPr>
-          <w:lang w:val="en-GB"/>
-        </w:rPr>
-        <w:t>URL_Environment</w:t>
-      </w:r>
-      <w:proofErr w:type="spellEnd"/>
-      <w:r>
-        <w:rPr>
-          <w:lang w:val="en-GB"/>
-        </w:rPr>
-        <w:t xml:space="preserve"> Acceptance</w:t>
-      </w:r>
+        <w:t>Naming convention can be with spaces or not: @URL_Environment Acceptance</w:t>
+      </w:r>
+    </w:p>
+    <w:p>
+      <w:pPr>
+        <w:rPr>
+          <w:lang w:val="en-GB"/>
+        </w:rPr>
+      </w:pPr>
+      <w:r>
+        <w:rPr>
+          <w:lang w:val="en-GB"/>
+        </w:rPr>
+        <w:br w:type="page"/>
+      </w:r>
+    </w:p>
+    <w:p>
+      <w:pPr>
+        <w:rPr>
+          <w:lang w:val="en-GB"/>
+        </w:rPr>
+      </w:pPr>
+    </w:p>
+    <w:sdt>
+      <w:sdtPr>
+        <w:rPr>
+          <w:rFonts w:asciiTheme="minorHAnsi" w:eastAsiaTheme="minorHAnsi" w:hAnsiTheme="minorHAnsi" w:cstheme="minorBidi"/>
+          <w:color w:val="auto"/>
+          <w:kern w:val="2"/>
+          <w:sz w:val="22"/>
+          <w:szCs w:val="22"/>
+          <w:lang w:val="en-IE"/>
+          <w14:ligatures w14:val="standardContextual"/>
+        </w:rPr>
+        <w:id w:val="-618144497"/>
+        <w:docPartObj>
+          <w:docPartGallery w:val="Table of Contents"/>
+          <w:docPartUnique/>
+        </w:docPartObj>
+      </w:sdtPr>
+      <w:sdtEndPr>
+        <w:rPr>
+          <w:b/>
+          <w:bCs/>
+          <w:noProof/>
+          <w:lang w:val="en-US"/>
+        </w:rPr>
+      </w:sdtEndPr>
+      <w:sdtContent>
+        <w:p>
+          <w:pPr>
+            <w:pStyle w:val="TOCHeading"/>
+          </w:pPr>
+          <w:r>
+            <w:t>Contents</w:t>
+          </w:r>
+        </w:p>
+        <w:p>
+          <w:pPr>
+            <w:pStyle w:val="TOC1"/>
+            <w:tabs>
+              <w:tab w:val="right" w:leader="dot" w:pos="9350"/>
+            </w:tabs>
+            <w:rPr>
+              <w:rFonts w:eastAsiaTheme="minorEastAsia"/>
+              <w:b w:val="0"/>
+              <w:noProof/>
+              <w:color w:val="auto"/>
+              <w:kern w:val="2"/>
+              <w:sz w:val="24"/>
+              <w:szCs w:val="24"/>
+              <w:lang w:val="en-BE" w:eastAsia="en-BE"/>
+              <w14:ligatures w14:val="standardContextual"/>
+            </w:rPr>
+          </w:pPr>
+          <w:r>
+            <w:rPr>
+              <w:b w:val="0"/>
+            </w:rPr>
+            <w:fldChar w:fldCharType="begin"/>
+          </w:r>
+          <w:r>
+            <w:rPr>
+              <w:b w:val="0"/>
+            </w:rPr>
+            <w:instrText xml:space="preserve"> TOC \o "1-2" \h \z \u </w:instrText>
+          </w:r>
+          <w:r>
+            <w:rPr>
+              <w:b w:val="0"/>
+            </w:rPr>
+            <w:fldChar w:fldCharType="separate"/>
+          </w:r>
+          <w:hyperlink w:anchor="_Toc224222354" w:history="1">
+            <w:r>
+              <w:rPr>
+                <w:rStyle w:val="Hyperlink"/>
+                <w:noProof/>
+                <w:lang w:val="en-GB"/>
+              </w:rPr>
+              <w:t>Foreword</w:t>
+            </w:r>
+            <w:r>
+              <w:rPr>
+                <w:noProof/>
+                <w:webHidden/>
+              </w:rPr>
+              <w:tab/>
+            </w:r>
+            <w:r>
+              <w:rPr>
+                <w:noProof/>
+                <w:webHidden/>
+              </w:rPr>
+              <w:fldChar w:fldCharType="begin"/>
+            </w:r>
+            <w:r>
+              <w:rPr>
+                <w:noProof/>
+                <w:webHidden/>
+              </w:rPr>
+              <w:instrText xml:space="preserve"> PAGEREF _Toc224222354 \h </w:instrText>
+            </w:r>
+            <w:r>
+              <w:rPr>
+                <w:noProof/>
+                <w:webHidden/>
+              </w:rPr>
+            </w:r>
+            <w:r>
+              <w:rPr>
+                <w:noProof/>
+                <w:webHidden/>
+              </w:rPr>
+              <w:fldChar w:fldCharType="separate"/>
+            </w:r>
+            <w:r>
+              <w:rPr>
+                <w:noProof/>
+                <w:webHidden/>
+              </w:rPr>
+              <w:t>2</w:t>
+            </w:r>
+            <w:r>
+              <w:rPr>
+                <w:noProof/>
+                <w:webHidden/>
+              </w:rPr>
+              <w:fldChar w:fldCharType="end"/>
+            </w:r>
+          </w:hyperlink>
+        </w:p>
+        <w:p>
+          <w:pPr>
+            <w:pStyle w:val="TOC1"/>
+            <w:tabs>
+              <w:tab w:val="right" w:leader="dot" w:pos="9350"/>
+            </w:tabs>
+            <w:rPr>
+              <w:rFonts w:eastAsiaTheme="minorEastAsia"/>
+              <w:b w:val="0"/>
+              <w:noProof/>
+              <w:color w:val="auto"/>
+              <w:kern w:val="2"/>
+              <w:sz w:val="24"/>
+              <w:szCs w:val="24"/>
+              <w:lang w:val="en-BE" w:eastAsia="en-BE"/>
+              <w14:ligatures w14:val="standardContextual"/>
+            </w:rPr>
+          </w:pPr>
+          <w:hyperlink w:anchor="_Toc224222355" w:history="1">
+            <w:r>
+              <w:rPr>
+                <w:rStyle w:val="Hyperlink"/>
+                <w:noProof/>
+                <w:lang w:val="en-GB"/>
+              </w:rPr>
+              <w:t>Architecture of a test</w:t>
+            </w:r>
+            <w:r>
+              <w:rPr>
+                <w:noProof/>
+                <w:webHidden/>
+              </w:rPr>
+              <w:tab/>
+            </w:r>
+            <w:r>
+              <w:rPr>
+                <w:noProof/>
+                <w:webHidden/>
+              </w:rPr>
+              <w:fldChar w:fldCharType="begin"/>
+            </w:r>
+            <w:r>
+              <w:rPr>
+                <w:noProof/>
+                <w:webHidden/>
+              </w:rPr>
+              <w:instrText xml:space="preserve"> PAGEREF _Toc224222355 \h </w:instrText>
+            </w:r>
+            <w:r>
+              <w:rPr>
+                <w:noProof/>
+                <w:webHidden/>
+              </w:rPr>
+            </w:r>
+            <w:r>
+              <w:rPr>
+                <w:noProof/>
+                <w:webHidden/>
+              </w:rPr>
+              <w:fldChar w:fldCharType="separate"/>
+            </w:r>
+            <w:r>
+              <w:rPr>
+                <w:noProof/>
+                <w:webHidden/>
+              </w:rPr>
+              <w:t>4</w:t>
+            </w:r>
+            <w:r>
+              <w:rPr>
+                <w:noProof/>
+                <w:webHidden/>
+              </w:rPr>
+              <w:fldChar w:fldCharType="end"/>
+            </w:r>
+          </w:hyperlink>
+        </w:p>
+        <w:p>
+          <w:pPr>
+            <w:pStyle w:val="TOC1"/>
+            <w:tabs>
+              <w:tab w:val="right" w:leader="dot" w:pos="9350"/>
+            </w:tabs>
+            <w:rPr>
+              <w:rFonts w:eastAsiaTheme="minorEastAsia"/>
+              <w:b w:val="0"/>
+              <w:noProof/>
+              <w:color w:val="auto"/>
+              <w:kern w:val="2"/>
+              <w:sz w:val="24"/>
+              <w:szCs w:val="24"/>
+              <w:lang w:val="en-BE" w:eastAsia="en-BE"/>
+              <w14:ligatures w14:val="standardContextual"/>
+            </w:rPr>
+          </w:pPr>
+          <w:hyperlink w:anchor="_Toc224222356" w:history="1">
+            <w:r>
+              <w:rPr>
+                <w:rStyle w:val="Hyperlink"/>
+                <w:noProof/>
+                <w:lang w:val="en-GB"/>
+              </w:rPr>
+              <w:t>Variables</w:t>
+            </w:r>
+            <w:r>
+              <w:rPr>
+                <w:noProof/>
+                <w:webHidden/>
+              </w:rPr>
+              <w:tab/>
+            </w:r>
+            <w:r>
+              <w:rPr>
+                <w:noProof/>
+                <w:webHidden/>
+              </w:rPr>
+              <w:fldChar w:fldCharType="begin"/>
+            </w:r>
+            <w:r>
+              <w:rPr>
+                <w:noProof/>
+                <w:webHidden/>
+              </w:rPr>
+              <w:instrText xml:space="preserve"> PAGEREF _Toc224222356 \h </w:instrText>
+            </w:r>
+            <w:r>
+              <w:rPr>
+                <w:noProof/>
+                <w:webHidden/>
+              </w:rPr>
+            </w:r>
+            <w:r>
+              <w:rPr>
+                <w:noProof/>
+                <w:webHidden/>
+              </w:rPr>
+              <w:fldChar w:fldCharType="separate"/>
+            </w:r>
+            <w:r>
+              <w:rPr>
+                <w:noProof/>
+                <w:webHidden/>
+              </w:rPr>
+              <w:t>5</w:t>
+            </w:r>
+            <w:r>
+              <w:rPr>
+                <w:noProof/>
+                <w:webHidden/>
+              </w:rPr>
+              <w:fldChar w:fldCharType="end"/>
+            </w:r>
+          </w:hyperlink>
+        </w:p>
+        <w:p>
+          <w:pPr>
+            <w:pStyle w:val="TOC1"/>
+            <w:tabs>
+              <w:tab w:val="right" w:leader="dot" w:pos="9350"/>
+            </w:tabs>
+            <w:rPr>
+              <w:rFonts w:eastAsiaTheme="minorEastAsia"/>
+              <w:b w:val="0"/>
+              <w:noProof/>
+              <w:color w:val="auto"/>
+              <w:kern w:val="2"/>
+              <w:sz w:val="24"/>
+              <w:szCs w:val="24"/>
+              <w:lang w:val="en-BE" w:eastAsia="en-BE"/>
+              <w14:ligatures w14:val="standardContextual"/>
+            </w:rPr>
+          </w:pPr>
+          <w:hyperlink w:anchor="_Toc224222357" w:history="1">
+            <w:r>
+              <w:rPr>
+                <w:rStyle w:val="Hyperlink"/>
+                <w:noProof/>
+                <w:lang w:val="en-GB"/>
+              </w:rPr>
+              <w:t>Variables in the rules</w:t>
+            </w:r>
+            <w:r>
+              <w:rPr>
+                <w:noProof/>
+                <w:webHidden/>
+              </w:rPr>
+              <w:tab/>
+            </w:r>
+            <w:r>
+              <w:rPr>
+                <w:noProof/>
+                <w:webHidden/>
+              </w:rPr>
+              <w:fldChar w:fldCharType="begin"/>
+            </w:r>
+            <w:r>
+              <w:rPr>
+                <w:noProof/>
+                <w:webHidden/>
+              </w:rPr>
+              <w:instrText xml:space="preserve"> PAGEREF _Toc224222357 \h </w:instrText>
+            </w:r>
+            <w:r>
+              <w:rPr>
+                <w:noProof/>
+                <w:webHidden/>
+              </w:rPr>
+            </w:r>
+            <w:r>
+              <w:rPr>
+                <w:noProof/>
+                <w:webHidden/>
+              </w:rPr>
+              <w:fldChar w:fldCharType="separate"/>
+            </w:r>
+            <w:r>
+              <w:rPr>
+                <w:noProof/>
+                <w:webHidden/>
+              </w:rPr>
+              <w:t>5</w:t>
+            </w:r>
+            <w:r>
+              <w:rPr>
+                <w:noProof/>
+                <w:webHidden/>
+              </w:rPr>
+              <w:fldChar w:fldCharType="end"/>
+            </w:r>
+          </w:hyperlink>
+        </w:p>
+        <w:p>
+          <w:pPr>
+            <w:pStyle w:val="TOC1"/>
+            <w:tabs>
+              <w:tab w:val="right" w:leader="dot" w:pos="9350"/>
+            </w:tabs>
+            <w:rPr>
+              <w:rFonts w:eastAsiaTheme="minorEastAsia"/>
+              <w:b w:val="0"/>
+              <w:noProof/>
+              <w:color w:val="auto"/>
+              <w:kern w:val="2"/>
+              <w:sz w:val="24"/>
+              <w:szCs w:val="24"/>
+              <w:lang w:val="en-BE" w:eastAsia="en-BE"/>
+              <w14:ligatures w14:val="standardContextual"/>
+            </w:rPr>
+          </w:pPr>
+          <w:hyperlink w:anchor="_Toc224222358" w:history="1">
+            <w:r>
+              <w:rPr>
+                <w:rStyle w:val="Hyperlink"/>
+                <w:noProof/>
+                <w:lang w:val="en-GB"/>
+              </w:rPr>
+              <w:t>Comments in the tests</w:t>
+            </w:r>
+            <w:r>
+              <w:rPr>
+                <w:noProof/>
+                <w:webHidden/>
+              </w:rPr>
+              <w:tab/>
+            </w:r>
+            <w:r>
+              <w:rPr>
+                <w:noProof/>
+                <w:webHidden/>
+              </w:rPr>
+              <w:fldChar w:fldCharType="begin"/>
+            </w:r>
+            <w:r>
+              <w:rPr>
+                <w:noProof/>
+                <w:webHidden/>
+              </w:rPr>
+              <w:instrText xml:space="preserve"> PAGEREF _Toc224222358 \h </w:instrText>
+            </w:r>
+            <w:r>
+              <w:rPr>
+                <w:noProof/>
+                <w:webHidden/>
+              </w:rPr>
+            </w:r>
+            <w:r>
+              <w:rPr>
+                <w:noProof/>
+                <w:webHidden/>
+              </w:rPr>
+              <w:fldChar w:fldCharType="separate"/>
+            </w:r>
+            <w:r>
+              <w:rPr>
+                <w:noProof/>
+                <w:webHidden/>
+              </w:rPr>
+              <w:t>6</w:t>
+            </w:r>
+            <w:r>
+              <w:rPr>
+                <w:noProof/>
+                <w:webHidden/>
+              </w:rPr>
+              <w:fldChar w:fldCharType="end"/>
+            </w:r>
+          </w:hyperlink>
+        </w:p>
+        <w:p>
+          <w:pPr>
+            <w:pStyle w:val="TOC1"/>
+            <w:tabs>
+              <w:tab w:val="right" w:leader="dot" w:pos="9350"/>
+            </w:tabs>
+            <w:rPr>
+              <w:rFonts w:eastAsiaTheme="minorEastAsia"/>
+              <w:b w:val="0"/>
+              <w:noProof/>
+              <w:color w:val="auto"/>
+              <w:kern w:val="2"/>
+              <w:sz w:val="24"/>
+              <w:szCs w:val="24"/>
+              <w:lang w:val="en-BE" w:eastAsia="en-BE"/>
+              <w14:ligatures w14:val="standardContextual"/>
+            </w:rPr>
+          </w:pPr>
+          <w:hyperlink w:anchor="_Toc224222359" w:history="1">
+            <w:r>
+              <w:rPr>
+                <w:rStyle w:val="Hyperlink"/>
+                <w:noProof/>
+              </w:rPr>
+              <w:t>The Roles</w:t>
+            </w:r>
+            <w:r>
+              <w:rPr>
+                <w:noProof/>
+                <w:webHidden/>
+              </w:rPr>
+              <w:tab/>
+            </w:r>
+            <w:r>
+              <w:rPr>
+                <w:noProof/>
+                <w:webHidden/>
+              </w:rPr>
+              <w:fldChar w:fldCharType="begin"/>
+            </w:r>
+            <w:r>
+              <w:rPr>
+                <w:noProof/>
+                <w:webHidden/>
+              </w:rPr>
+              <w:instrText xml:space="preserve"> PAGEREF _Toc224222359 \h </w:instrText>
+            </w:r>
+            <w:r>
+              <w:rPr>
+                <w:noProof/>
+                <w:webHidden/>
+              </w:rPr>
+            </w:r>
+            <w:r>
+              <w:rPr>
+                <w:noProof/>
+                <w:webHidden/>
+              </w:rPr>
+              <w:fldChar w:fldCharType="separate"/>
+            </w:r>
+            <w:r>
+              <w:rPr>
+                <w:noProof/>
+                <w:webHidden/>
+              </w:rPr>
+              <w:t>7</w:t>
+            </w:r>
+            <w:r>
+              <w:rPr>
+                <w:noProof/>
+                <w:webHidden/>
+              </w:rPr>
+              <w:fldChar w:fldCharType="end"/>
+            </w:r>
+          </w:hyperlink>
+        </w:p>
+        <w:p>
+          <w:pPr>
+            <w:pStyle w:val="TOC1"/>
+            <w:tabs>
+              <w:tab w:val="right" w:leader="dot" w:pos="9350"/>
+            </w:tabs>
+            <w:rPr>
+              <w:rFonts w:eastAsiaTheme="minorEastAsia"/>
+              <w:b w:val="0"/>
+              <w:noProof/>
+              <w:color w:val="auto"/>
+              <w:kern w:val="2"/>
+              <w:sz w:val="24"/>
+              <w:szCs w:val="24"/>
+              <w:lang w:val="en-BE" w:eastAsia="en-BE"/>
+              <w14:ligatures w14:val="standardContextual"/>
+            </w:rPr>
+          </w:pPr>
+          <w:hyperlink w:anchor="_Toc224222360" w:history="1">
+            <w:r>
+              <w:rPr>
+                <w:rStyle w:val="Hyperlink"/>
+                <w:noProof/>
+              </w:rPr>
+              <w:t>The Dictionary</w:t>
+            </w:r>
+            <w:r>
+              <w:rPr>
+                <w:noProof/>
+                <w:webHidden/>
+              </w:rPr>
+              <w:tab/>
+            </w:r>
+            <w:r>
+              <w:rPr>
+                <w:noProof/>
+                <w:webHidden/>
+              </w:rPr>
+              <w:fldChar w:fldCharType="begin"/>
+            </w:r>
+            <w:r>
+              <w:rPr>
+                <w:noProof/>
+                <w:webHidden/>
+              </w:rPr>
+              <w:instrText xml:space="preserve"> PAGEREF _Toc224222360 \h </w:instrText>
+            </w:r>
+            <w:r>
+              <w:rPr>
+                <w:noProof/>
+                <w:webHidden/>
+              </w:rPr>
+            </w:r>
+            <w:r>
+              <w:rPr>
+                <w:noProof/>
+                <w:webHidden/>
+              </w:rPr>
+              <w:fldChar w:fldCharType="separate"/>
+            </w:r>
+            <w:r>
+              <w:rPr>
+                <w:noProof/>
+                <w:webHidden/>
+              </w:rPr>
+              <w:t>9</w:t>
+            </w:r>
+            <w:r>
+              <w:rPr>
+                <w:noProof/>
+                <w:webHidden/>
+              </w:rPr>
+              <w:fldChar w:fldCharType="end"/>
+            </w:r>
+          </w:hyperlink>
+        </w:p>
+        <w:p>
+          <w:pPr>
+            <w:pStyle w:val="TOC1"/>
+            <w:tabs>
+              <w:tab w:val="right" w:leader="dot" w:pos="9350"/>
+            </w:tabs>
+            <w:rPr>
+              <w:rFonts w:eastAsiaTheme="minorEastAsia"/>
+              <w:b w:val="0"/>
+              <w:noProof/>
+              <w:color w:val="auto"/>
+              <w:kern w:val="2"/>
+              <w:sz w:val="24"/>
+              <w:szCs w:val="24"/>
+              <w:lang w:val="en-BE" w:eastAsia="en-BE"/>
+              <w14:ligatures w14:val="standardContextual"/>
+            </w:rPr>
+          </w:pPr>
+          <w:hyperlink w:anchor="_Toc224222361" w:history="1">
+            <w:r>
+              <w:rPr>
+                <w:rStyle w:val="Hyperlink"/>
+                <w:noProof/>
+              </w:rPr>
+              <w:t>The Dataset</w:t>
+            </w:r>
+            <w:r>
+              <w:rPr>
+                <w:noProof/>
+                <w:webHidden/>
+              </w:rPr>
+              <w:tab/>
+            </w:r>
+            <w:r>
+              <w:rPr>
+                <w:noProof/>
+                <w:webHidden/>
+              </w:rPr>
+              <w:fldChar w:fldCharType="begin"/>
+            </w:r>
+            <w:r>
+              <w:rPr>
+                <w:noProof/>
+                <w:webHidden/>
+              </w:rPr>
+              <w:instrText xml:space="preserve"> PAGEREF _Toc224222361 \h </w:instrText>
+            </w:r>
+            <w:r>
+              <w:rPr>
+                <w:noProof/>
+                <w:webHidden/>
+              </w:rPr>
+            </w:r>
+            <w:r>
+              <w:rPr>
+                <w:noProof/>
+                <w:webHidden/>
+              </w:rPr>
+              <w:fldChar w:fldCharType="separate"/>
+            </w:r>
+            <w:r>
+              <w:rPr>
+                <w:noProof/>
+                <w:webHidden/>
+              </w:rPr>
+              <w:t>10</w:t>
+            </w:r>
+            <w:r>
+              <w:rPr>
+                <w:noProof/>
+                <w:webHidden/>
+              </w:rPr>
+              <w:fldChar w:fldCharType="end"/>
+            </w:r>
+          </w:hyperlink>
+        </w:p>
+        <w:p>
+          <w:pPr>
+            <w:pStyle w:val="TOC1"/>
+            <w:tabs>
+              <w:tab w:val="right" w:leader="dot" w:pos="9350"/>
+            </w:tabs>
+            <w:rPr>
+              <w:rFonts w:eastAsiaTheme="minorEastAsia"/>
+              <w:b w:val="0"/>
+              <w:noProof/>
+              <w:color w:val="auto"/>
+              <w:kern w:val="2"/>
+              <w:sz w:val="24"/>
+              <w:szCs w:val="24"/>
+              <w:lang w:val="en-BE" w:eastAsia="en-BE"/>
+              <w14:ligatures w14:val="standardContextual"/>
+            </w:rPr>
+          </w:pPr>
+          <w:hyperlink w:anchor="_Toc224222362" w:history="1">
+            <w:r>
+              <w:rPr>
+                <w:rStyle w:val="Hyperlink"/>
+                <w:noProof/>
+              </w:rPr>
+              <w:t>The Reference</w:t>
+            </w:r>
+            <w:r>
+              <w:rPr>
+                <w:noProof/>
+                <w:webHidden/>
+              </w:rPr>
+              <w:tab/>
+            </w:r>
+            <w:r>
+              <w:rPr>
+                <w:noProof/>
+                <w:webHidden/>
+              </w:rPr>
+              <w:fldChar w:fldCharType="begin"/>
+            </w:r>
+            <w:r>
+              <w:rPr>
+                <w:noProof/>
+                <w:webHidden/>
+              </w:rPr>
+              <w:instrText xml:space="preserve"> PAGEREF _Toc224222362 \h </w:instrText>
+            </w:r>
+            <w:r>
+              <w:rPr>
+                <w:noProof/>
+                <w:webHidden/>
+              </w:rPr>
+            </w:r>
+            <w:r>
+              <w:rPr>
+                <w:noProof/>
+                <w:webHidden/>
+              </w:rPr>
+              <w:fldChar w:fldCharType="separate"/>
+            </w:r>
+            <w:r>
+              <w:rPr>
+                <w:noProof/>
+                <w:webHidden/>
+              </w:rPr>
+              <w:t>11</w:t>
+            </w:r>
+            <w:r>
+              <w:rPr>
+                <w:noProof/>
+                <w:webHidden/>
+              </w:rPr>
+              <w:fldChar w:fldCharType="end"/>
+            </w:r>
+          </w:hyperlink>
+        </w:p>
+        <w:p>
+          <w:pPr>
+            <w:pStyle w:val="TOC1"/>
+            <w:tabs>
+              <w:tab w:val="right" w:leader="dot" w:pos="9350"/>
+            </w:tabs>
+            <w:rPr>
+              <w:rFonts w:eastAsiaTheme="minorEastAsia"/>
+              <w:b w:val="0"/>
+              <w:noProof/>
+              <w:color w:val="auto"/>
+              <w:kern w:val="2"/>
+              <w:sz w:val="24"/>
+              <w:szCs w:val="24"/>
+              <w:lang w:val="en-BE" w:eastAsia="en-BE"/>
+              <w14:ligatures w14:val="standardContextual"/>
+            </w:rPr>
+          </w:pPr>
+          <w:hyperlink w:anchor="_Toc224222363" w:history="1">
+            <w:r>
+              <w:rPr>
+                <w:rStyle w:val="Hyperlink"/>
+                <w:noProof/>
+              </w:rPr>
+              <w:t>The Scenario</w:t>
+            </w:r>
+            <w:r>
+              <w:rPr>
+                <w:noProof/>
+                <w:webHidden/>
+              </w:rPr>
+              <w:tab/>
+            </w:r>
+            <w:r>
+              <w:rPr>
+                <w:noProof/>
+                <w:webHidden/>
+              </w:rPr>
+              <w:fldChar w:fldCharType="begin"/>
+            </w:r>
+            <w:r>
+              <w:rPr>
+                <w:noProof/>
+                <w:webHidden/>
+              </w:rPr>
+              <w:instrText xml:space="preserve"> PAGEREF _Toc224222363 \h </w:instrText>
+            </w:r>
+            <w:r>
+              <w:rPr>
+                <w:noProof/>
+                <w:webHidden/>
+              </w:rPr>
+            </w:r>
+            <w:r>
+              <w:rPr>
+                <w:noProof/>
+                <w:webHidden/>
+              </w:rPr>
+              <w:fldChar w:fldCharType="separate"/>
+            </w:r>
+            <w:r>
+              <w:rPr>
+                <w:noProof/>
+                <w:webHidden/>
+              </w:rPr>
+              <w:t>12</w:t>
+            </w:r>
+            <w:r>
+              <w:rPr>
+                <w:noProof/>
+                <w:webHidden/>
+              </w:rPr>
+              <w:fldChar w:fldCharType="end"/>
+            </w:r>
+          </w:hyperlink>
+        </w:p>
+        <w:p>
+          <w:pPr>
+            <w:pStyle w:val="TOC1"/>
+            <w:tabs>
+              <w:tab w:val="right" w:leader="dot" w:pos="9350"/>
+            </w:tabs>
+            <w:rPr>
+              <w:rFonts w:eastAsiaTheme="minorEastAsia"/>
+              <w:b w:val="0"/>
+              <w:noProof/>
+              <w:color w:val="auto"/>
+              <w:kern w:val="2"/>
+              <w:sz w:val="24"/>
+              <w:szCs w:val="24"/>
+              <w:lang w:val="en-BE" w:eastAsia="en-BE"/>
+              <w14:ligatures w14:val="standardContextual"/>
+            </w:rPr>
+          </w:pPr>
+          <w:hyperlink w:anchor="_Toc224222364" w:history="1">
+            <w:r>
+              <w:rPr>
+                <w:rStyle w:val="Hyperlink"/>
+                <w:noProof/>
+              </w:rPr>
+              <w:t>The Suite</w:t>
+            </w:r>
+            <w:r>
+              <w:rPr>
+                <w:noProof/>
+                <w:webHidden/>
+              </w:rPr>
+              <w:tab/>
+            </w:r>
+            <w:r>
+              <w:rPr>
+                <w:noProof/>
+                <w:webHidden/>
+              </w:rPr>
+              <w:fldChar w:fldCharType="begin"/>
+            </w:r>
+            <w:r>
+              <w:rPr>
+                <w:noProof/>
+                <w:webHidden/>
+              </w:rPr>
+              <w:instrText xml:space="preserve"> PAGEREF _Toc224222364 \h </w:instrText>
+            </w:r>
+            <w:r>
+              <w:rPr>
+                <w:noProof/>
+                <w:webHidden/>
+              </w:rPr>
+            </w:r>
+            <w:r>
+              <w:rPr>
+                <w:noProof/>
+                <w:webHidden/>
+              </w:rPr>
+              <w:fldChar w:fldCharType="separate"/>
+            </w:r>
+            <w:r>
+              <w:rPr>
+                <w:noProof/>
+                <w:webHidden/>
+              </w:rPr>
+              <w:t>13</w:t>
+            </w:r>
+            <w:r>
+              <w:rPr>
+                <w:noProof/>
+                <w:webHidden/>
+              </w:rPr>
+              <w:fldChar w:fldCharType="end"/>
+            </w:r>
+          </w:hyperlink>
+        </w:p>
+        <w:p>
+          <w:pPr>
+            <w:pStyle w:val="TOC1"/>
+            <w:tabs>
+              <w:tab w:val="right" w:leader="dot" w:pos="9350"/>
+            </w:tabs>
+            <w:rPr>
+              <w:rFonts w:eastAsiaTheme="minorEastAsia"/>
+              <w:b w:val="0"/>
+              <w:noProof/>
+              <w:color w:val="auto"/>
+              <w:kern w:val="2"/>
+              <w:sz w:val="24"/>
+              <w:szCs w:val="24"/>
+              <w:lang w:val="en-BE" w:eastAsia="en-BE"/>
+              <w14:ligatures w14:val="standardContextual"/>
+            </w:rPr>
+          </w:pPr>
+          <w:hyperlink w:anchor="_Toc224222365" w:history="1">
+            <w:r>
+              <w:rPr>
+                <w:rStyle w:val="Hyperlink"/>
+                <w:noProof/>
+              </w:rPr>
+              <w:t>The Story</w:t>
+            </w:r>
+            <w:r>
+              <w:rPr>
+                <w:noProof/>
+                <w:webHidden/>
+              </w:rPr>
+              <w:tab/>
+            </w:r>
+            <w:r>
+              <w:rPr>
+                <w:noProof/>
+                <w:webHidden/>
+              </w:rPr>
+              <w:fldChar w:fldCharType="begin"/>
+            </w:r>
+            <w:r>
+              <w:rPr>
+                <w:noProof/>
+                <w:webHidden/>
+              </w:rPr>
+              <w:instrText xml:space="preserve"> PAGEREF _Toc224222365 \h </w:instrText>
+            </w:r>
+            <w:r>
+              <w:rPr>
+                <w:noProof/>
+                <w:webHidden/>
+              </w:rPr>
+            </w:r>
+            <w:r>
+              <w:rPr>
+                <w:noProof/>
+                <w:webHidden/>
+              </w:rPr>
+              <w:fldChar w:fldCharType="separate"/>
+            </w:r>
+            <w:r>
+              <w:rPr>
+                <w:noProof/>
+                <w:webHidden/>
+              </w:rPr>
+              <w:t>14</w:t>
+            </w:r>
+            <w:r>
+              <w:rPr>
+                <w:noProof/>
+                <w:webHidden/>
+              </w:rPr>
+              <w:fldChar w:fldCharType="end"/>
+            </w:r>
+          </w:hyperlink>
+        </w:p>
+        <w:p>
+          <w:pPr>
+            <w:pStyle w:val="TOC1"/>
+            <w:tabs>
+              <w:tab w:val="right" w:leader="dot" w:pos="9350"/>
+            </w:tabs>
+            <w:rPr>
+              <w:rFonts w:eastAsiaTheme="minorEastAsia"/>
+              <w:b w:val="0"/>
+              <w:noProof/>
+              <w:color w:val="auto"/>
+              <w:kern w:val="2"/>
+              <w:sz w:val="24"/>
+              <w:szCs w:val="24"/>
+              <w:lang w:val="en-BE" w:eastAsia="en-BE"/>
+              <w14:ligatures w14:val="standardContextual"/>
+            </w:rPr>
+          </w:pPr>
+          <w:hyperlink w:anchor="_Toc224222366" w:history="1">
+            <w:r>
+              <w:rPr>
+                <w:rStyle w:val="Hyperlink"/>
+                <w:noProof/>
+              </w:rPr>
+              <w:t>The Rules</w:t>
+            </w:r>
+            <w:r>
+              <w:rPr>
+                <w:noProof/>
+                <w:webHidden/>
+              </w:rPr>
+              <w:tab/>
+            </w:r>
+            <w:r>
+              <w:rPr>
+                <w:noProof/>
+                <w:webHidden/>
+              </w:rPr>
+              <w:fldChar w:fldCharType="begin"/>
+            </w:r>
+            <w:r>
+              <w:rPr>
+                <w:noProof/>
+                <w:webHidden/>
+              </w:rPr>
+              <w:instrText xml:space="preserve"> PAGEREF _Toc224222366 \h </w:instrText>
+            </w:r>
+            <w:r>
+              <w:rPr>
+                <w:noProof/>
+                <w:webHidden/>
+              </w:rPr>
+            </w:r>
+            <w:r>
+              <w:rPr>
+                <w:noProof/>
+                <w:webHidden/>
+              </w:rPr>
+              <w:fldChar w:fldCharType="separate"/>
+            </w:r>
+            <w:r>
+              <w:rPr>
+                <w:noProof/>
+                <w:webHidden/>
+              </w:rPr>
+              <w:t>16</w:t>
+            </w:r>
+            <w:r>
+              <w:rPr>
+                <w:noProof/>
+                <w:webHidden/>
+              </w:rPr>
+              <w:fldChar w:fldCharType="end"/>
+            </w:r>
+          </w:hyperlink>
+        </w:p>
+        <w:p>
+          <w:pPr>
+            <w:pStyle w:val="TOC1"/>
+            <w:tabs>
+              <w:tab w:val="right" w:leader="dot" w:pos="9350"/>
+            </w:tabs>
+            <w:rPr>
+              <w:rFonts w:eastAsiaTheme="minorEastAsia"/>
+              <w:b w:val="0"/>
+              <w:noProof/>
+              <w:color w:val="auto"/>
+              <w:kern w:val="2"/>
+              <w:sz w:val="24"/>
+              <w:szCs w:val="24"/>
+              <w:lang w:val="en-BE" w:eastAsia="en-BE"/>
+              <w14:ligatures w14:val="standardContextual"/>
+            </w:rPr>
+          </w:pPr>
+          <w:hyperlink w:anchor="_Toc224222367" w:history="1">
+            <w:r>
+              <w:rPr>
+                <w:rStyle w:val="Hyperlink"/>
+                <w:noProof/>
+              </w:rPr>
+              <w:t>AI Robot</w:t>
+            </w:r>
+            <w:r>
+              <w:rPr>
+                <w:noProof/>
+                <w:webHidden/>
+              </w:rPr>
+              <w:tab/>
+            </w:r>
+            <w:r>
+              <w:rPr>
+                <w:noProof/>
+                <w:webHidden/>
+              </w:rPr>
+              <w:fldChar w:fldCharType="begin"/>
+            </w:r>
+            <w:r>
+              <w:rPr>
+                <w:noProof/>
+                <w:webHidden/>
+              </w:rPr>
+              <w:instrText xml:space="preserve"> PAGEREF _Toc224222367 \h </w:instrText>
+            </w:r>
+            <w:r>
+              <w:rPr>
+                <w:noProof/>
+                <w:webHidden/>
+              </w:rPr>
+            </w:r>
+            <w:r>
+              <w:rPr>
+                <w:noProof/>
+                <w:webHidden/>
+              </w:rPr>
+              <w:fldChar w:fldCharType="separate"/>
+            </w:r>
+            <w:r>
+              <w:rPr>
+                <w:noProof/>
+                <w:webHidden/>
+              </w:rPr>
+              <w:t>17</w:t>
+            </w:r>
+            <w:r>
+              <w:rPr>
+                <w:noProof/>
+                <w:webHidden/>
+              </w:rPr>
+              <w:fldChar w:fldCharType="end"/>
+            </w:r>
+          </w:hyperlink>
+        </w:p>
+        <w:p>
+          <w:pPr>
+            <w:rPr>
+              <w:b/>
+              <w:bCs/>
+              <w:noProof/>
+            </w:rPr>
+          </w:pPr>
+          <w:r>
+            <w:rPr>
+              <w:b/>
+              <w:color w:val="0070C0"/>
+            </w:rPr>
+            <w:fldChar w:fldCharType="end"/>
+          </w:r>
+        </w:p>
+      </w:sdtContent>
+    </w:sdt>
+    <w:p>
+      <w:pPr>
+        <w:rPr>
+          <w:lang w:val="en-GB"/>
+        </w:rPr>
+      </w:pPr>
+    </w:p>
+    <w:p>
+      <w:pPr>
+        <w:rPr>
+          <w:lang w:val="en-GB"/>
+        </w:rPr>
+      </w:pPr>
     </w:p>
     <w:p>
       <w:pPr>
@@ -667,8 +1820,21 @@
           <w:lang w:val="en-GB"/>
         </w:rPr>
       </w:pPr>
-      <w:r>
-        <w:rPr>
+    </w:p>
+    <w:p>
+      <w:pPr>
+        <w:rPr>
+          <w:rFonts w:asciiTheme="majorHAnsi" w:eastAsiaTheme="majorEastAsia" w:hAnsiTheme="majorHAnsi" w:cstheme="majorBidi"/>
+          <w:b/>
+          <w:color w:val="2F5496" w:themeColor="accent1" w:themeShade="BF"/>
+          <w:sz w:val="32"/>
+          <w:szCs w:val="32"/>
+          <w:lang w:val="en-GB"/>
+        </w:rPr>
+      </w:pPr>
+      <w:r>
+        <w:rPr>
+          <w:b/>
           <w:lang w:val="en-GB"/>
         </w:rPr>
         <w:br w:type="page"/>
@@ -682,6 +1848,7 @@
           <w:lang w:val="en-GB"/>
         </w:rPr>
       </w:pPr>
+      <w:bookmarkStart w:id="1" w:name="_Toc224222355"/>
       <w:r>
         <w:rPr>
           <w:b/>
@@ -690,6 +1857,7 @@
         <w:lastRenderedPageBreak/>
         <w:t>Architecture of a test</w:t>
       </w:r>
+      <w:bookmarkEnd w:id="1"/>
     </w:p>
     <w:p>
       <w:pPr>
@@ -741,7 +1909,7 @@
           <w:lang w:val="en-IE" w:eastAsia="en-IE"/>
         </w:rPr>
         <w:drawing>
-          <wp:inline distT="0" distB="0" distL="0" distR="0" wp14:anchorId="2C0C7BD8" wp14:editId="19C097C6">
+          <wp:inline distT="0" distB="0" distL="0" distR="0" wp14:anchorId="2C0C7BD8" wp14:editId="612FC73F">
             <wp:extent cx="6151245" cy="2222986"/>
             <wp:effectExtent l="0" t="0" r="1905" b="6350"/>
             <wp:docPr id="8" name="Picture 8"/>
@@ -1088,6 +2256,659 @@
     <w:p>
       <w:pPr>
         <w:rPr>
+          <w:b/>
+          <w:lang w:val="en-GB"/>
+        </w:rPr>
+      </w:pPr>
+      <w:r>
+        <w:rPr>
+          <w:b/>
+          <w:lang w:val="en-GB"/>
+        </w:rPr>
+        <w:br w:type="page"/>
+      </w:r>
+    </w:p>
+    <w:p>
+      <w:pPr>
+        <w:pStyle w:val="Heading1"/>
+        <w:rPr>
+          <w:b/>
+          <w:lang w:val="en-GB"/>
+        </w:rPr>
+      </w:pPr>
+      <w:bookmarkStart w:id="2" w:name="_Toc224222356"/>
+      <w:r>
+        <w:rPr>
+          <w:b/>
+          <w:lang w:val="en-GB"/>
+        </w:rPr>
+        <w:lastRenderedPageBreak/>
+        <w:t>Variable</w:t>
+      </w:r>
+      <w:r>
+        <w:rPr>
+          <w:b/>
+          <w:lang w:val="en-GB"/>
+        </w:rPr>
+        <w:t>s</w:t>
+      </w:r>
+      <w:bookmarkEnd w:id="2"/>
+    </w:p>
+    <w:p>
+      <w:pPr>
+        <w:rPr>
+          <w:lang w:val="en-GB"/>
+        </w:rPr>
+      </w:pPr>
+    </w:p>
+    <w:p>
+      <w:pPr>
+        <w:rPr>
+          <w:lang w:val="en-GB"/>
+        </w:rPr>
+      </w:pPr>
+      <w:r>
+        <w:rPr>
+          <w:lang w:val="en-GB"/>
+        </w:rPr>
+        <w:t>A lot of functions allow you to work with variables</w:t>
+      </w:r>
+      <w:r>
+        <w:rPr>
+          <w:lang w:val="en-GB"/>
+        </w:rPr>
+        <w:t>:</w:t>
+      </w:r>
+      <w:r>
+        <w:rPr>
+          <w:lang w:val="en-GB"/>
+        </w:rPr>
+        <w:br/>
+        <w:t xml:space="preserve">    </w:t>
+      </w:r>
+      <w:proofErr w:type="spellStart"/>
+      <w:r>
+        <w:rPr>
+          <w:lang w:val="en-GB"/>
+        </w:rPr>
+        <w:t>setVariable</w:t>
+      </w:r>
+      <w:proofErr w:type="spellEnd"/>
+      <w:r>
+        <w:rPr>
+          <w:lang w:val="en-GB"/>
+        </w:rPr>
+        <w:t xml:space="preserve">(), </w:t>
+      </w:r>
+      <w:proofErr w:type="spellStart"/>
+      <w:r>
+        <w:rPr>
+          <w:lang w:val="en-GB"/>
+        </w:rPr>
+        <w:t>httpSearchValue</w:t>
+      </w:r>
+      <w:proofErr w:type="spellEnd"/>
+      <w:r>
+        <w:rPr>
+          <w:lang w:val="en-GB"/>
+        </w:rPr>
+        <w:t xml:space="preserve">(), </w:t>
+      </w:r>
+      <w:proofErr w:type="spellStart"/>
+      <w:r>
+        <w:rPr>
+          <w:lang w:val="en-GB"/>
+        </w:rPr>
+        <w:t>httpKeyCount</w:t>
+      </w:r>
+      <w:proofErr w:type="spellEnd"/>
+      <w:r>
+        <w:rPr>
+          <w:lang w:val="en-GB"/>
+        </w:rPr>
+        <w:t xml:space="preserve">(), </w:t>
+      </w:r>
+      <w:proofErr w:type="spellStart"/>
+      <w:r>
+        <w:rPr>
+          <w:lang w:val="en-GB"/>
+        </w:rPr>
+        <w:t>getUrl</w:t>
+      </w:r>
+      <w:proofErr w:type="spellEnd"/>
+      <w:r>
+        <w:rPr>
+          <w:lang w:val="en-GB"/>
+        </w:rPr>
+        <w:t>()…</w:t>
+      </w:r>
+    </w:p>
+    <w:p>
+      <w:pPr>
+        <w:rPr>
+          <w:lang w:val="en-GB"/>
+        </w:rPr>
+      </w:pPr>
+    </w:p>
+    <w:p>
+      <w:pPr>
+        <w:rPr>
+          <w:lang w:val="en-GB"/>
+        </w:rPr>
+      </w:pPr>
+      <w:r>
+        <w:rPr>
+          <w:lang w:val="en-GB"/>
+        </w:rPr>
+        <w:t xml:space="preserve">A variable is a way to exchange information inside your scenario. </w:t>
+      </w:r>
+      <w:r>
+        <w:rPr>
+          <w:lang w:val="en-GB"/>
+        </w:rPr>
+        <w:br/>
+        <w:t xml:space="preserve">At the end of the scenario, the variables are destroyed. If you need to keep a value persistent, </w:t>
+      </w:r>
+      <w:r>
+        <w:rPr>
+          <w:lang w:val="en-GB"/>
+        </w:rPr>
+        <w:br/>
+        <w:t>you can use the ‘Reference’ object.</w:t>
+      </w:r>
+    </w:p>
+    <w:p>
+      <w:pPr>
+        <w:rPr>
+          <w:lang w:val="en-GB"/>
+        </w:rPr>
+      </w:pPr>
+      <w:r>
+        <w:rPr>
+          <w:lang w:val="en-GB"/>
+        </w:rPr>
+        <w:t>A variable starts by the symbol “</w:t>
+      </w:r>
+      <w:r>
+        <w:rPr>
+          <w:b/>
+          <w:bCs/>
+          <w:lang w:val="en-GB"/>
+        </w:rPr>
+        <w:t>$</w:t>
+      </w:r>
+      <w:r>
+        <w:rPr>
+          <w:lang w:val="en-GB"/>
+        </w:rPr>
+        <w:t xml:space="preserve">”: </w:t>
+      </w:r>
+      <w:r>
+        <w:rPr>
+          <w:lang w:val="en-GB"/>
+        </w:rPr>
+        <w:br/>
+      </w:r>
+      <w:proofErr w:type="spellStart"/>
+      <w:r>
+        <w:rPr>
+          <w:lang w:val="en-GB"/>
+        </w:rPr>
+        <w:t>e.g</w:t>
+      </w:r>
+      <w:proofErr w:type="spellEnd"/>
+      <w:r>
+        <w:rPr>
+          <w:lang w:val="en-GB"/>
+        </w:rPr>
+        <w:t xml:space="preserve"> </w:t>
+      </w:r>
+      <w:r>
+        <w:rPr>
+          <w:lang w:val="en-GB"/>
+        </w:rPr>
+        <w:t xml:space="preserve">: </w:t>
+      </w:r>
+      <w:proofErr w:type="spellStart"/>
+      <w:r>
+        <w:rPr>
+          <w:lang w:val="en-GB"/>
+        </w:rPr>
+        <w:t>setVariable</w:t>
+      </w:r>
+      <w:proofErr w:type="spellEnd"/>
+      <w:r>
+        <w:rPr>
+          <w:lang w:val="en-GB"/>
+        </w:rPr>
+        <w:t xml:space="preserve"> (“</w:t>
+      </w:r>
+      <w:r>
+        <w:rPr>
+          <w:b/>
+          <w:bCs/>
+          <w:lang w:val="en-GB"/>
+        </w:rPr>
+        <w:t>$Test</w:t>
+      </w:r>
+      <w:r>
+        <w:rPr>
+          <w:lang w:val="en-GB"/>
+        </w:rPr>
+        <w:t xml:space="preserve">”, “a simple test”)  </w:t>
+      </w:r>
+    </w:p>
+    <w:p>
+      <w:pPr>
+        <w:rPr>
+          <w:lang w:val="en-GB"/>
+        </w:rPr>
+      </w:pPr>
+      <w:r>
+        <w:rPr>
+          <w:lang w:val="en-GB"/>
+        </w:rPr>
+        <w:t>In some cases, you need to have a custom name for your variables.</w:t>
+      </w:r>
+      <w:r>
+        <w:rPr>
+          <w:lang w:val="en-GB"/>
+        </w:rPr>
+        <w:br/>
+        <w:t xml:space="preserve">For instance, </w:t>
+      </w:r>
+      <w:r>
+        <w:rPr>
+          <w:lang w:val="en-GB"/>
+        </w:rPr>
+        <w:t>inside a loop, you need to have a variable with the position of the loop:</w:t>
+      </w:r>
+      <w:r>
+        <w:rPr>
+          <w:lang w:val="en-GB"/>
+        </w:rPr>
+        <w:br/>
+      </w:r>
+      <w:proofErr w:type="spellStart"/>
+      <w:r>
+        <w:rPr>
+          <w:lang w:val="en-GB"/>
+        </w:rPr>
+        <w:t>e.g</w:t>
+      </w:r>
+      <w:proofErr w:type="spellEnd"/>
+      <w:r>
+        <w:rPr>
+          <w:lang w:val="en-GB"/>
+        </w:rPr>
+        <w:t>: $certificate_1, $certificate_2, $certificate_3</w:t>
+      </w:r>
+    </w:p>
+    <w:p>
+      <w:pPr>
+        <w:rPr>
+          <w:lang w:val="en-GB"/>
+        </w:rPr>
+      </w:pPr>
+      <w:r>
+        <w:rPr>
+          <w:lang w:val="en-GB"/>
+        </w:rPr>
+        <w:t>In this case, you can double the symbol “</w:t>
+      </w:r>
+      <w:r>
+        <w:rPr>
+          <w:b/>
+          <w:bCs/>
+          <w:lang w:val="en-GB"/>
+        </w:rPr>
+        <w:t>$$</w:t>
+      </w:r>
+      <w:r>
+        <w:rPr>
+          <w:lang w:val="en-GB"/>
+        </w:rPr>
+        <w:t>”</w:t>
+      </w:r>
+      <w:r>
+        <w:rPr>
+          <w:lang w:val="en-GB"/>
+        </w:rPr>
+        <w:br/>
+      </w:r>
+      <w:proofErr w:type="spellStart"/>
+      <w:r>
+        <w:rPr>
+          <w:lang w:val="en-GB"/>
+        </w:rPr>
+        <w:t>e.g</w:t>
+      </w:r>
+      <w:proofErr w:type="spellEnd"/>
+      <w:r>
+        <w:rPr>
+          <w:lang w:val="en-GB"/>
+        </w:rPr>
+        <w:t xml:space="preserve"> </w:t>
+      </w:r>
+      <w:r>
+        <w:rPr>
+          <w:lang w:val="en-GB"/>
+        </w:rPr>
+        <w:t xml:space="preserve">: </w:t>
+      </w:r>
+      <w:proofErr w:type="spellStart"/>
+      <w:r>
+        <w:rPr>
+          <w:lang w:val="en-GB"/>
+        </w:rPr>
+        <w:t>setVariable</w:t>
+      </w:r>
+      <w:proofErr w:type="spellEnd"/>
+      <w:r>
+        <w:rPr>
+          <w:lang w:val="en-GB"/>
+        </w:rPr>
+        <w:t xml:space="preserve"> (“$</w:t>
+      </w:r>
+      <w:r>
+        <w:rPr>
+          <w:lang w:val="en-GB"/>
+        </w:rPr>
+        <w:t>certificate</w:t>
+      </w:r>
+      <w:r>
+        <w:rPr>
+          <w:lang w:val="en-GB"/>
+        </w:rPr>
+        <w:t>_</w:t>
+      </w:r>
+      <w:r>
+        <w:rPr>
+          <w:b/>
+          <w:bCs/>
+          <w:lang w:val="en-GB"/>
+        </w:rPr>
+        <w:t>$$Loop</w:t>
+      </w:r>
+      <w:r>
+        <w:rPr>
+          <w:lang w:val="en-GB"/>
+        </w:rPr>
+        <w:t>”, “a simple test”)</w:t>
+      </w:r>
+      <w:r>
+        <w:rPr>
+          <w:lang w:val="en-GB"/>
+        </w:rPr>
+        <w:br/>
+        <w:t xml:space="preserve">         the name of the variable will be $certificate_1 (if $Loop = 1)</w:t>
+      </w:r>
+      <w:r>
+        <w:rPr>
+          <w:lang w:val="en-GB"/>
+        </w:rPr>
+        <w:t xml:space="preserve">  </w:t>
+      </w:r>
+    </w:p>
+    <w:p>
+      <w:pPr>
+        <w:rPr>
+          <w:lang w:val="en-GB"/>
+        </w:rPr>
+      </w:pPr>
+    </w:p>
+    <w:p>
+      <w:pPr>
+        <w:rPr>
+          <w:lang w:val="en-GB"/>
+        </w:rPr>
+      </w:pPr>
+    </w:p>
+    <w:p>
+      <w:pPr>
+        <w:rPr>
+          <w:lang w:val="en-GB"/>
+        </w:rPr>
+      </w:pPr>
+    </w:p>
+    <w:p>
+      <w:pPr>
+        <w:pStyle w:val="Heading1"/>
+        <w:rPr>
+          <w:b/>
+          <w:lang w:val="en-GB"/>
+        </w:rPr>
+      </w:pPr>
+      <w:bookmarkStart w:id="3" w:name="_Toc224222357"/>
+      <w:r>
+        <w:rPr>
+          <w:b/>
+          <w:lang w:val="en-GB"/>
+        </w:rPr>
+        <w:t>Variable</w:t>
+      </w:r>
+      <w:r>
+        <w:rPr>
+          <w:b/>
+          <w:lang w:val="en-GB"/>
+        </w:rPr>
+        <w:t>s</w:t>
+      </w:r>
+      <w:r>
+        <w:rPr>
+          <w:b/>
+          <w:lang w:val="en-GB"/>
+        </w:rPr>
+        <w:t xml:space="preserve"> in the rules</w:t>
+      </w:r>
+      <w:bookmarkEnd w:id="3"/>
+    </w:p>
+    <w:p>
+      <w:pPr>
+        <w:rPr>
+          <w:lang w:val="en-GB"/>
+        </w:rPr>
+      </w:pPr>
+    </w:p>
+    <w:p>
+      <w:r>
+        <w:t>I</w:t>
+      </w:r>
+      <w:r>
+        <w:t xml:space="preserve">n the rule, the sign </w:t>
+      </w:r>
+      <w:r>
+        <w:t>“</w:t>
+      </w:r>
+      <w:r>
+        <w:rPr>
+          <w:b/>
+          <w:bCs/>
+        </w:rPr>
+        <w:t>$</w:t>
+      </w:r>
+      <w:r>
+        <w:t>”</w:t>
+      </w:r>
+      <w:r>
+        <w:t xml:space="preserve"> for the variable must be replaced by the sign: </w:t>
+      </w:r>
+      <w:r>
+        <w:t>“</w:t>
+      </w:r>
+      <w:r>
+        <w:rPr>
+          <w:b/>
+          <w:bCs/>
+        </w:rPr>
+        <w:t>§</w:t>
+      </w:r>
+      <w:r>
+        <w:t>”</w:t>
+      </w:r>
+      <w:r>
+        <w:br/>
+      </w:r>
+      <w:proofErr w:type="spellStart"/>
+      <w:r>
+        <w:t>e.g</w:t>
+      </w:r>
+      <w:proofErr w:type="spellEnd"/>
+      <w:r>
+        <w:t xml:space="preserve">: #setVariable: </w:t>
+      </w:r>
+      <w:r>
+        <w:t>(“</w:t>
+      </w:r>
+      <w:r>
+        <w:rPr>
+          <w:b/>
+          <w:bCs/>
+        </w:rPr>
+        <w:t>§Test</w:t>
+      </w:r>
+      <w:r>
+        <w:t>”</w:t>
+      </w:r>
+      <w:r>
+        <w:t xml:space="preserve">, </w:t>
+      </w:r>
+      <w:r>
+        <w:t>“</w:t>
+      </w:r>
+      <w:r>
+        <w:t>A simple test</w:t>
+      </w:r>
+      <w:r>
+        <w:t>”)</w:t>
+      </w:r>
+    </w:p>
+    <w:p>
+      <w:r>
+        <w:t>If you need a custom name, you can use a single “</w:t>
+      </w:r>
+      <w:r>
+        <w:rPr>
+          <w:b/>
+          <w:bCs/>
+        </w:rPr>
+        <w:t>$</w:t>
+      </w:r>
+      <w:r>
+        <w:t>”</w:t>
+      </w:r>
+      <w:r>
+        <w:br/>
+      </w:r>
+      <w:proofErr w:type="spellStart"/>
+      <w:r>
+        <w:rPr>
+          <w:lang w:val="en-GB"/>
+        </w:rPr>
+        <w:t>e.g</w:t>
+      </w:r>
+      <w:proofErr w:type="spellEnd"/>
+      <w:r>
+        <w:rPr>
+          <w:lang w:val="en-GB"/>
+        </w:rPr>
+        <w:t xml:space="preserve"> </w:t>
+      </w:r>
+      <w:r>
+        <w:rPr>
+          <w:lang w:val="en-GB"/>
+        </w:rPr>
+        <w:t xml:space="preserve">: </w:t>
+      </w:r>
+      <w:proofErr w:type="spellStart"/>
+      <w:r>
+        <w:rPr>
+          <w:lang w:val="en-GB"/>
+        </w:rPr>
+        <w:t>setVariable</w:t>
+      </w:r>
+      <w:proofErr w:type="spellEnd"/>
+      <w:r>
+        <w:rPr>
+          <w:lang w:val="en-GB"/>
+        </w:rPr>
+        <w:t xml:space="preserve"> (“</w:t>
+      </w:r>
+      <w:r>
+        <w:rPr>
+          <w:lang w:val="en-GB"/>
+        </w:rPr>
+        <w:t>§</w:t>
+      </w:r>
+      <w:proofErr w:type="spellStart"/>
+      <w:r>
+        <w:rPr>
+          <w:lang w:val="en-GB"/>
+        </w:rPr>
+        <w:t>certificate</w:t>
+      </w:r>
+      <w:r>
+        <w:rPr>
+          <w:lang w:val="en-GB"/>
+        </w:rPr>
+        <w:t>_</w:t>
+      </w:r>
+      <w:r>
+        <w:rPr>
+          <w:b/>
+          <w:bCs/>
+          <w:lang w:val="en-GB"/>
+        </w:rPr>
+        <w:t>$Loop</w:t>
+      </w:r>
+      <w:proofErr w:type="spellEnd"/>
+      <w:r>
+        <w:rPr>
+          <w:lang w:val="en-GB"/>
+        </w:rPr>
+        <w:t xml:space="preserve">”, “a simple test”)  </w:t>
+      </w:r>
+      <w:r>
+        <w:rPr>
+          <w:lang w:val="en-GB"/>
+        </w:rPr>
+        <w:br/>
+      </w:r>
+      <w:r>
+        <w:rPr>
+          <w:lang w:val="en-GB"/>
+        </w:rPr>
+        <w:t xml:space="preserve">         the name of the variable</w:t>
+      </w:r>
+      <w:r>
+        <w:rPr>
+          <w:lang w:val="en-GB"/>
+        </w:rPr>
+        <w:t xml:space="preserve"> in the rule</w:t>
+      </w:r>
+      <w:r>
+        <w:rPr>
+          <w:lang w:val="en-GB"/>
+        </w:rPr>
+        <w:t xml:space="preserve"> will be §certificate_1 (if $Loop = 1)</w:t>
+      </w:r>
+      <w:r>
+        <w:rPr>
+          <w:lang w:val="en-GB"/>
+        </w:rPr>
+        <w:t xml:space="preserve">  </w:t>
+      </w:r>
+    </w:p>
+    <w:p>
+      <w:pPr>
+        <w:rPr>
+          <w:lang w:val="en-GB"/>
+        </w:rPr>
+      </w:pPr>
+    </w:p>
+    <w:p>
+      <w:pPr>
+        <w:rPr>
           <w:rFonts w:asciiTheme="majorHAnsi" w:eastAsiaTheme="majorEastAsia" w:hAnsiTheme="majorHAnsi" w:cstheme="majorBidi"/>
           <w:b/>
           <w:color w:val="2F5496" w:themeColor="accent1" w:themeShade="BF"/>
@@ -1098,7 +2919,11 @@
       </w:pPr>
       <w:r>
         <w:rPr>
+          <w:rFonts w:asciiTheme="majorHAnsi" w:eastAsiaTheme="majorEastAsia" w:hAnsiTheme="majorHAnsi" w:cstheme="majorBidi"/>
           <w:b/>
+          <w:color w:val="2F5496" w:themeColor="accent1" w:themeShade="BF"/>
+          <w:sz w:val="32"/>
+          <w:szCs w:val="32"/>
           <w:lang w:val="en-GB"/>
         </w:rPr>
         <w:br w:type="page"/>
@@ -1106,18 +2931,30 @@
     </w:p>
     <w:p>
       <w:pPr>
+        <w:rPr>
+          <w:rFonts w:asciiTheme="majorHAnsi" w:eastAsiaTheme="majorEastAsia" w:hAnsiTheme="majorHAnsi" w:cstheme="majorBidi"/>
+          <w:b/>
+          <w:color w:val="2F5496" w:themeColor="accent1" w:themeShade="BF"/>
+          <w:sz w:val="32"/>
+          <w:szCs w:val="32"/>
+          <w:lang w:val="en-GB"/>
+        </w:rPr>
+      </w:pPr>
+    </w:p>
+    <w:p>
+      <w:pPr>
         <w:pStyle w:val="Heading1"/>
         <w:rPr>
           <w:b/>
           <w:lang w:val="en-GB"/>
         </w:rPr>
       </w:pPr>
+      <w:bookmarkStart w:id="4" w:name="_Toc224222358"/>
       <w:r>
         <w:rPr>
           <w:b/>
           <w:lang w:val="en-GB"/>
         </w:rPr>
-        <w:lastRenderedPageBreak/>
         <w:t>Comments</w:t>
       </w:r>
       <w:r>
@@ -1148,6 +2985,7 @@
         </w:rPr>
         <w:t>s</w:t>
       </w:r>
+      <w:bookmarkEnd w:id="4"/>
     </w:p>
     <w:p>
       <w:pPr>
@@ -1288,6 +3126,7 @@
       </w:pPr>
       <w:r>
         <w:rPr>
+          <w:noProof/>
           <w:lang w:val="en-GB"/>
         </w:rPr>
         <w:drawing>
@@ -1463,8 +3302,6 @@
           <w:lang w:val="en-GB"/>
         </w:rPr>
       </w:pPr>
-      <w:bookmarkStart w:id="0" w:name="_GoBack"/>
-      <w:bookmarkEnd w:id="0"/>
     </w:p>
     <w:p>
       <w:pPr>
@@ -1486,6 +3323,7 @@
           <w:b/>
         </w:rPr>
       </w:pPr>
+      <w:bookmarkStart w:id="5" w:name="_Toc224222359"/>
       <w:r>
         <w:rPr>
           <w:b/>
@@ -1499,6 +3337,7 @@
         </w:rPr>
         <w:t>Roles</w:t>
       </w:r>
+      <w:bookmarkEnd w:id="5"/>
     </w:p>
     <w:p/>
     <w:p>
@@ -1959,6 +3798,7 @@
           <w:b/>
         </w:rPr>
       </w:pPr>
+      <w:bookmarkStart w:id="6" w:name="_Toc224222360"/>
       <w:r>
         <w:rPr>
           <w:b/>
@@ -1966,6 +3806,7 @@
         <w:lastRenderedPageBreak/>
         <w:t>The Dictionary</w:t>
       </w:r>
+      <w:bookmarkEnd w:id="6"/>
     </w:p>
     <w:p/>
     <w:p>
@@ -2341,6 +4182,7 @@
           <w:b/>
         </w:rPr>
       </w:pPr>
+      <w:bookmarkStart w:id="7" w:name="_Toc224222361"/>
       <w:r>
         <w:rPr>
           <w:b/>
@@ -2360,6 +4202,7 @@
         </w:rPr>
         <w:t>ataset</w:t>
       </w:r>
+      <w:bookmarkEnd w:id="7"/>
     </w:p>
     <w:p>
       <w:pPr>
@@ -2738,6 +4581,7 @@
           <w:b/>
         </w:rPr>
       </w:pPr>
+      <w:bookmarkStart w:id="8" w:name="_Toc224222362"/>
       <w:r>
         <w:rPr>
           <w:b/>
@@ -2757,6 +4601,7 @@
         </w:rPr>
         <w:t>eference</w:t>
       </w:r>
+      <w:bookmarkEnd w:id="8"/>
     </w:p>
     <w:p>
       <w:pPr>
@@ -3079,6 +4924,7 @@
           <w:b/>
         </w:rPr>
       </w:pPr>
+      <w:bookmarkStart w:id="9" w:name="_Toc224222363"/>
       <w:r>
         <w:rPr>
           <w:b/>
@@ -3092,6 +4938,7 @@
         </w:rPr>
         <w:t>Scenario</w:t>
       </w:r>
+      <w:bookmarkEnd w:id="9"/>
     </w:p>
     <w:p/>
     <w:p>
@@ -3252,21 +5099,7 @@
         <w:rPr>
           <w:lang w:val="en-GB"/>
         </w:rPr>
-        <w:t xml:space="preserve">. If you have a huge number of use cases and you want to create </w:t>
-      </w:r>
-      <w:proofErr w:type="spellStart"/>
-      <w:r>
-        <w:rPr>
-          <w:lang w:val="en-GB"/>
-        </w:rPr>
-        <w:t>a</w:t>
-      </w:r>
-      <w:proofErr w:type="spellEnd"/>
-      <w:r>
-        <w:rPr>
-          <w:lang w:val="en-GB"/>
-        </w:rPr>
-        <w:t xml:space="preserve"> automatic sanity check, you can use this feature to randomly check a specific use case </w:t>
+        <w:t xml:space="preserve">. If you have a huge number of use cases and you want to create a automatic sanity check, you can use this feature to randomly check a specific use case </w:t>
       </w:r>
       <w:r>
         <w:rPr>
@@ -3361,6 +5194,7 @@
           <w:b/>
         </w:rPr>
       </w:pPr>
+      <w:bookmarkStart w:id="10" w:name="_Toc224222364"/>
       <w:r>
         <w:rPr>
           <w:b/>
@@ -3374,6 +5208,7 @@
         </w:rPr>
         <w:t>Suite</w:t>
       </w:r>
+      <w:bookmarkEnd w:id="10"/>
     </w:p>
     <w:p/>
     <w:p>
@@ -3435,7 +5270,7 @@
           <w:lang w:val="en-IE" w:eastAsia="en-IE"/>
         </w:rPr>
         <w:drawing>
-          <wp:inline distT="0" distB="0" distL="0" distR="0" wp14:anchorId="64D39A2F" wp14:editId="7C27CEBB">
+          <wp:inline distT="0" distB="0" distL="0" distR="0" wp14:anchorId="64D39A2F" wp14:editId="06540AD2">
             <wp:extent cx="2304636" cy="1514475"/>
             <wp:effectExtent l="0" t="0" r="635" b="0"/>
             <wp:docPr id="10" name="Picture 10"/>
@@ -3571,6 +5406,7 @@
           <w:b/>
         </w:rPr>
       </w:pPr>
+      <w:bookmarkStart w:id="11" w:name="_Toc224222365"/>
       <w:r>
         <w:rPr>
           <w:b/>
@@ -3584,6 +5420,7 @@
         </w:rPr>
         <w:t>Story</w:t>
       </w:r>
+      <w:bookmarkEnd w:id="11"/>
     </w:p>
     <w:p/>
     <w:p>
@@ -3848,6 +5685,7 @@
           <w:b/>
         </w:rPr>
       </w:pPr>
+      <w:bookmarkStart w:id="12" w:name="_Toc224222366"/>
       <w:r>
         <w:rPr>
           <w:b/>
@@ -3855,6 +5693,7 @@
         <w:lastRenderedPageBreak/>
         <w:t>The Rules</w:t>
       </w:r>
+      <w:bookmarkEnd w:id="12"/>
     </w:p>
     <w:p/>
     <w:p>
@@ -3982,6 +5821,7 @@
           <w:b/>
         </w:rPr>
       </w:pPr>
+      <w:bookmarkStart w:id="13" w:name="_Toc224222367"/>
       <w:r>
         <w:rPr>
           <w:b/>
@@ -3989,6 +5829,7 @@
         <w:lastRenderedPageBreak/>
         <w:t>AI Robot</w:t>
       </w:r>
+      <w:bookmarkEnd w:id="13"/>
     </w:p>
     <w:p>
       <w:pPr>
@@ -4198,21 +6039,7 @@
         <w:rPr>
           <w:lang w:val="en-GB"/>
         </w:rPr>
-        <w:t xml:space="preserve">, </w:t>
-      </w:r>
-      <w:proofErr w:type="spellStart"/>
-      <w:r>
-        <w:rPr>
-          <w:lang w:val="en-GB"/>
-        </w:rPr>
-        <w:t>otherwhile</w:t>
-      </w:r>
-      <w:proofErr w:type="spellEnd"/>
-      <w:r>
-        <w:rPr>
-          <w:lang w:val="en-GB"/>
-        </w:rPr>
-        <w:t xml:space="preserve"> your pattern will not work with the Cancel button (ID=</w:t>
+        <w:t>, otherwhile your pattern will not work with the Cancel button (ID=</w:t>
       </w:r>
       <w:proofErr w:type="spellStart"/>
       <w:r>
@@ -4681,8 +6508,10 @@
       </w:pPr>
     </w:p>
     <w:sectPr>
-      <w:headerReference w:type="default" r:id="rId29"/>
-      <w:footerReference w:type="default" r:id="rId30"/>
+      <w:headerReference w:type="even" r:id="rId29"/>
+      <w:headerReference w:type="default" r:id="rId30"/>
+      <w:footerReference w:type="default" r:id="rId31"/>
+      <w:headerReference w:type="first" r:id="rId32"/>
       <w:pgSz w:w="12240" w:h="15840"/>
       <w:pgMar w:top="1440" w:right="1440" w:bottom="1440" w:left="1440" w:header="708" w:footer="708" w:gutter="0"/>
       <w:cols w:space="708"/>
@@ -4693,7 +6522,7 @@
 </file>
 
 <file path=word/endnotes.xml><?xml version="1.0" encoding="utf-8"?>
-<w:endnotes xmlns:wpc="http://schemas.microsoft.com/office/word/2010/wordprocessingCanvas" xmlns:cx="http://schemas.microsoft.com/office/drawing/2014/chartex" xmlns:mc="http://schemas.openxmlformats.org/markup-compatibility/2006" xmlns:o="urn:schemas-microsoft-com:office:office" xmlns:r="http://schemas.openxmlformats.org/officeDocument/2006/relationships" xmlns:m="http://schemas.openxmlformats.org/officeDocument/2006/math" xmlns:v="urn:schemas-microsoft-com:vml" xmlns:wp14="http://schemas.microsoft.com/office/word/2010/wordprocessingDrawing" xmlns:wp="http://schemas.openxmlformats.org/drawingml/2006/wordprocessingDrawing" xmlns:w10="urn:schemas-microsoft-com:office:word" xmlns:w="http://schemas.openxmlformats.org/wordprocessingml/2006/main" xmlns:w14="http://schemas.microsoft.com/office/word/2010/wordml" xmlns:w15="http://schemas.microsoft.com/office/word/2012/wordml" xmlns:w16se="http://schemas.microsoft.com/office/word/2015/wordml/symex" xmlns:wpg="http://schemas.microsoft.com/office/word/2010/wordprocessingGroup" xmlns:wpi="http://schemas.microsoft.com/office/word/2010/wordprocessingInk" xmlns:wne="http://schemas.microsoft.com/office/word/2006/wordml" xmlns:wps="http://schemas.microsoft.com/office/word/2010/wordprocessingShape" mc:Ignorable="w14 w15 w16se wp14">
+<w:endnotes xmlns:wpc="http://schemas.microsoft.com/office/word/2010/wordprocessingCanvas" xmlns:cx="http://schemas.microsoft.com/office/drawing/2014/chartex" xmlns:cx1="http://schemas.microsoft.com/office/drawing/2015/9/8/chartex" xmlns:cx2="http://schemas.microsoft.com/office/drawing/2015/10/21/chartex" xmlns:cx3="http://schemas.microsoft.com/office/drawing/2016/5/9/chartex" xmlns:cx4="http://schemas.microsoft.com/office/drawing/2016/5/10/chartex" xmlns:cx5="http://schemas.microsoft.com/office/drawing/2016/5/11/chartex" xmlns:cx6="http://schemas.microsoft.com/office/drawing/2016/5/12/chartex" xmlns:cx7="http://schemas.microsoft.com/office/drawing/2016/5/13/chartex" xmlns:cx8="http://schemas.microsoft.com/office/drawing/2016/5/14/chartex" xmlns:mc="http://schemas.openxmlformats.org/markup-compatibility/2006" xmlns:aink="http://schemas.microsoft.com/office/drawing/2016/ink" xmlns:am3d="http://schemas.microsoft.com/office/drawing/2017/model3d" xmlns:o="urn:schemas-microsoft-com:office:office" xmlns:oel="http://schemas.microsoft.com/office/2019/extlst" xmlns:r="http://schemas.openxmlformats.org/officeDocument/2006/relationships" xmlns:m="http://schemas.openxmlformats.org/officeDocument/2006/math" xmlns:v="urn:schemas-microsoft-com:vml" xmlns:wp14="http://schemas.microsoft.com/office/word/2010/wordprocessingDrawing" xmlns:wp="http://schemas.openxmlformats.org/drawingml/2006/wordprocessingDrawing" xmlns:w10="urn:schemas-microsoft-com:office:word" xmlns:w="http://schemas.openxmlformats.org/wordprocessingml/2006/main" xmlns:w14="http://schemas.microsoft.com/office/word/2010/wordml" xmlns:w15="http://schemas.microsoft.com/office/word/2012/wordml" xmlns:w16cex="http://schemas.microsoft.com/office/word/2018/wordml/cex" xmlns:w16cid="http://schemas.microsoft.com/office/word/2016/wordml/cid" xmlns:w16="http://schemas.microsoft.com/office/word/2018/wordml" xmlns:w16du="http://schemas.microsoft.com/office/word/2023/wordml/word16du" xmlns:w16sdtdh="http://schemas.microsoft.com/office/word/2020/wordml/sdtdatahash" xmlns:w16sdtfl="http://schemas.microsoft.com/office/word/2024/wordml/sdtformatlock" xmlns:w16se="http://schemas.microsoft.com/office/word/2015/wordml/symex" xmlns:wpg="http://schemas.microsoft.com/office/word/2010/wordprocessingGroup" xmlns:wpi="http://schemas.microsoft.com/office/word/2010/wordprocessingInk" xmlns:wne="http://schemas.microsoft.com/office/word/2006/wordml" xmlns:wps="http://schemas.microsoft.com/office/word/2010/wordprocessingShape" mc:Ignorable="w14 w15 w16se w16cid w16 w16cex w16sdtdh w16sdtfl w16du wp14">
   <w:endnote w:type="separator" w:id="-1">
     <w:p>
       <w:pPr>
@@ -4718,7 +6547,7 @@
 </file>
 
 <file path=word/footer1.xml><?xml version="1.0" encoding="utf-8"?>
-<w:ftr xmlns:wpc="http://schemas.microsoft.com/office/word/2010/wordprocessingCanvas" xmlns:cx="http://schemas.microsoft.com/office/drawing/2014/chartex" xmlns:mc="http://schemas.openxmlformats.org/markup-compatibility/2006" xmlns:o="urn:schemas-microsoft-com:office:office" xmlns:r="http://schemas.openxmlformats.org/officeDocument/2006/relationships" xmlns:m="http://schemas.openxmlformats.org/officeDocument/2006/math" xmlns:v="urn:schemas-microsoft-com:vml" xmlns:wp14="http://schemas.microsoft.com/office/word/2010/wordprocessingDrawing" xmlns:wp="http://schemas.openxmlformats.org/drawingml/2006/wordprocessingDrawing" xmlns:w10="urn:schemas-microsoft-com:office:word" xmlns:w="http://schemas.openxmlformats.org/wordprocessingml/2006/main" xmlns:w14="http://schemas.microsoft.com/office/word/2010/wordml" xmlns:w15="http://schemas.microsoft.com/office/word/2012/wordml" xmlns:w16se="http://schemas.microsoft.com/office/word/2015/wordml/symex" xmlns:wpg="http://schemas.microsoft.com/office/word/2010/wordprocessingGroup" xmlns:wpi="http://schemas.microsoft.com/office/word/2010/wordprocessingInk" xmlns:wne="http://schemas.microsoft.com/office/word/2006/wordml" xmlns:wps="http://schemas.microsoft.com/office/word/2010/wordprocessingShape" mc:Ignorable="w14 w15 w16se wp14">
+<w:ftr xmlns:wpc="http://schemas.microsoft.com/office/word/2010/wordprocessingCanvas" xmlns:cx="http://schemas.microsoft.com/office/drawing/2014/chartex" xmlns:cx1="http://schemas.microsoft.com/office/drawing/2015/9/8/chartex" xmlns:cx2="http://schemas.microsoft.com/office/drawing/2015/10/21/chartex" xmlns:cx3="http://schemas.microsoft.com/office/drawing/2016/5/9/chartex" xmlns:cx4="http://schemas.microsoft.com/office/drawing/2016/5/10/chartex" xmlns:cx5="http://schemas.microsoft.com/office/drawing/2016/5/11/chartex" xmlns:cx6="http://schemas.microsoft.com/office/drawing/2016/5/12/chartex" xmlns:cx7="http://schemas.microsoft.com/office/drawing/2016/5/13/chartex" xmlns:cx8="http://schemas.microsoft.com/office/drawing/2016/5/14/chartex" xmlns:mc="http://schemas.openxmlformats.org/markup-compatibility/2006" xmlns:aink="http://schemas.microsoft.com/office/drawing/2016/ink" xmlns:am3d="http://schemas.microsoft.com/office/drawing/2017/model3d" xmlns:o="urn:schemas-microsoft-com:office:office" xmlns:oel="http://schemas.microsoft.com/office/2019/extlst" xmlns:r="http://schemas.openxmlformats.org/officeDocument/2006/relationships" xmlns:m="http://schemas.openxmlformats.org/officeDocument/2006/math" xmlns:v="urn:schemas-microsoft-com:vml" xmlns:wp14="http://schemas.microsoft.com/office/word/2010/wordprocessingDrawing" xmlns:wp="http://schemas.openxmlformats.org/drawingml/2006/wordprocessingDrawing" xmlns:w10="urn:schemas-microsoft-com:office:word" xmlns:w="http://schemas.openxmlformats.org/wordprocessingml/2006/main" xmlns:w14="http://schemas.microsoft.com/office/word/2010/wordml" xmlns:w15="http://schemas.microsoft.com/office/word/2012/wordml" xmlns:w16cex="http://schemas.microsoft.com/office/word/2018/wordml/cex" xmlns:w16cid="http://schemas.microsoft.com/office/word/2016/wordml/cid" xmlns:w16="http://schemas.microsoft.com/office/word/2018/wordml" xmlns:w16du="http://schemas.microsoft.com/office/word/2023/wordml/word16du" xmlns:w16sdtdh="http://schemas.microsoft.com/office/word/2020/wordml/sdtdatahash" xmlns:w16sdtfl="http://schemas.microsoft.com/office/word/2024/wordml/sdtformatlock" xmlns:w16se="http://schemas.microsoft.com/office/word/2015/wordml/symex" xmlns:wpg="http://schemas.microsoft.com/office/word/2010/wordprocessingGroup" xmlns:wpi="http://schemas.microsoft.com/office/word/2010/wordprocessingInk" xmlns:wne="http://schemas.microsoft.com/office/word/2006/wordml" xmlns:wps="http://schemas.microsoft.com/office/word/2010/wordprocessingShape" mc:Ignorable="w14 w15 w16se w16cid w16 w16cex w16sdtdh w16sdtfl w16du wp14">
   <w:p>
     <w:pPr>
       <w:pStyle w:val="Footer"/>
@@ -4767,13 +6596,28 @@
             </w:tabs>
           </w:pPr>
           <w:r>
-            <w:t>V1.0 – 21/</w:t>
+            <w:t>V1.</w:t>
           </w:r>
           <w:r>
-            <w:t>11</w:t>
+            <w:t>1</w:t>
           </w:r>
           <w:r>
-            <w:t>/2024</w:t>
+            <w:t xml:space="preserve"> – </w:t>
+          </w:r>
+          <w:r>
+            <w:t>12</w:t>
+          </w:r>
+          <w:r>
+            <w:t>/</w:t>
+          </w:r>
+          <w:r>
+            <w:t>03</w:t>
+          </w:r>
+          <w:r>
+            <w:t>/202</w:t>
+          </w:r>
+          <w:r>
+            <w:t>6</w:t>
           </w:r>
         </w:p>
       </w:tc>
@@ -4842,15 +6686,10 @@
             </w:tabs>
           </w:pPr>
           <w:r>
-            <w:t>@</w:t>
+            <w:t>@ArtComputer 202</w:t>
           </w:r>
-          <w:proofErr w:type="spellStart"/>
           <w:r>
-            <w:t>ArtComputer</w:t>
-          </w:r>
-          <w:proofErr w:type="spellEnd"/>
-          <w:r>
-            <w:t xml:space="preserve"> 2024</w:t>
+            <w:t>6</w:t>
           </w:r>
         </w:p>
       </w:tc>
@@ -4870,7 +6709,7 @@
 </file>
 
 <file path=word/footnotes.xml><?xml version="1.0" encoding="utf-8"?>
-<w:footnotes xmlns:wpc="http://schemas.microsoft.com/office/word/2010/wordprocessingCanvas" xmlns:cx="http://schemas.microsoft.com/office/drawing/2014/chartex" xmlns:mc="http://schemas.openxmlformats.org/markup-compatibility/2006" xmlns:o="urn:schemas-microsoft-com:office:office" xmlns:r="http://schemas.openxmlformats.org/officeDocument/2006/relationships" xmlns:m="http://schemas.openxmlformats.org/officeDocument/2006/math" xmlns:v="urn:schemas-microsoft-com:vml" xmlns:wp14="http://schemas.microsoft.com/office/word/2010/wordprocessingDrawing" xmlns:wp="http://schemas.openxmlformats.org/drawingml/2006/wordprocessingDrawing" xmlns:w10="urn:schemas-microsoft-com:office:word" xmlns:w="http://schemas.openxmlformats.org/wordprocessingml/2006/main" xmlns:w14="http://schemas.microsoft.com/office/word/2010/wordml" xmlns:w15="http://schemas.microsoft.com/office/word/2012/wordml" xmlns:w16se="http://schemas.microsoft.com/office/word/2015/wordml/symex" xmlns:wpg="http://schemas.microsoft.com/office/word/2010/wordprocessingGroup" xmlns:wpi="http://schemas.microsoft.com/office/word/2010/wordprocessingInk" xmlns:wne="http://schemas.microsoft.com/office/word/2006/wordml" xmlns:wps="http://schemas.microsoft.com/office/word/2010/wordprocessingShape" mc:Ignorable="w14 w15 w16se wp14">
+<w:footnotes xmlns:wpc="http://schemas.microsoft.com/office/word/2010/wordprocessingCanvas" xmlns:cx="http://schemas.microsoft.com/office/drawing/2014/chartex" xmlns:cx1="http://schemas.microsoft.com/office/drawing/2015/9/8/chartex" xmlns:cx2="http://schemas.microsoft.com/office/drawing/2015/10/21/chartex" xmlns:cx3="http://schemas.microsoft.com/office/drawing/2016/5/9/chartex" xmlns:cx4="http://schemas.microsoft.com/office/drawing/2016/5/10/chartex" xmlns:cx5="http://schemas.microsoft.com/office/drawing/2016/5/11/chartex" xmlns:cx6="http://schemas.microsoft.com/office/drawing/2016/5/12/chartex" xmlns:cx7="http://schemas.microsoft.com/office/drawing/2016/5/13/chartex" xmlns:cx8="http://schemas.microsoft.com/office/drawing/2016/5/14/chartex" xmlns:mc="http://schemas.openxmlformats.org/markup-compatibility/2006" xmlns:aink="http://schemas.microsoft.com/office/drawing/2016/ink" xmlns:am3d="http://schemas.microsoft.com/office/drawing/2017/model3d" xmlns:o="urn:schemas-microsoft-com:office:office" xmlns:oel="http://schemas.microsoft.com/office/2019/extlst" xmlns:r="http://schemas.openxmlformats.org/officeDocument/2006/relationships" xmlns:m="http://schemas.openxmlformats.org/officeDocument/2006/math" xmlns:v="urn:schemas-microsoft-com:vml" xmlns:wp14="http://schemas.microsoft.com/office/word/2010/wordprocessingDrawing" xmlns:wp="http://schemas.openxmlformats.org/drawingml/2006/wordprocessingDrawing" xmlns:w10="urn:schemas-microsoft-com:office:word" xmlns:w="http://schemas.openxmlformats.org/wordprocessingml/2006/main" xmlns:w14="http://schemas.microsoft.com/office/word/2010/wordml" xmlns:w15="http://schemas.microsoft.com/office/word/2012/wordml" xmlns:w16cex="http://schemas.microsoft.com/office/word/2018/wordml/cex" xmlns:w16cid="http://schemas.microsoft.com/office/word/2016/wordml/cid" xmlns:w16="http://schemas.microsoft.com/office/word/2018/wordml" xmlns:w16du="http://schemas.microsoft.com/office/word/2023/wordml/word16du" xmlns:w16sdtdh="http://schemas.microsoft.com/office/word/2020/wordml/sdtdatahash" xmlns:w16sdtfl="http://schemas.microsoft.com/office/word/2024/wordml/sdtformatlock" xmlns:w16se="http://schemas.microsoft.com/office/word/2015/wordml/symex" xmlns:wpg="http://schemas.microsoft.com/office/word/2010/wordprocessingGroup" xmlns:wpi="http://schemas.microsoft.com/office/word/2010/wordprocessingInk" xmlns:wne="http://schemas.microsoft.com/office/word/2006/wordml" xmlns:wps="http://schemas.microsoft.com/office/word/2010/wordprocessingShape" mc:Ignorable="w14 w15 w16se w16cid w16 w16cex w16sdtdh w16sdtfl w16du wp14">
   <w:footnote w:type="separator" w:id="-1">
     <w:p>
       <w:pPr>
@@ -4895,7 +6734,17 @@
 </file>
 
 <file path=word/header1.xml><?xml version="1.0" encoding="utf-8"?>
-<w:hdr xmlns:wpc="http://schemas.microsoft.com/office/word/2010/wordprocessingCanvas" xmlns:cx="http://schemas.microsoft.com/office/drawing/2014/chartex" xmlns:mc="http://schemas.openxmlformats.org/markup-compatibility/2006" xmlns:o="urn:schemas-microsoft-com:office:office" xmlns:r="http://schemas.openxmlformats.org/officeDocument/2006/relationships" xmlns:m="http://schemas.openxmlformats.org/officeDocument/2006/math" xmlns:v="urn:schemas-microsoft-com:vml" xmlns:wp14="http://schemas.microsoft.com/office/word/2010/wordprocessingDrawing" xmlns:wp="http://schemas.openxmlformats.org/drawingml/2006/wordprocessingDrawing" xmlns:w10="urn:schemas-microsoft-com:office:word" xmlns:w="http://schemas.openxmlformats.org/wordprocessingml/2006/main" xmlns:w14="http://schemas.microsoft.com/office/word/2010/wordml" xmlns:w15="http://schemas.microsoft.com/office/word/2012/wordml" xmlns:w16se="http://schemas.microsoft.com/office/word/2015/wordml/symex" xmlns:wpg="http://schemas.microsoft.com/office/word/2010/wordprocessingGroup" xmlns:wpi="http://schemas.microsoft.com/office/word/2010/wordprocessingInk" xmlns:wne="http://schemas.microsoft.com/office/word/2006/wordml" xmlns:wps="http://schemas.microsoft.com/office/word/2010/wordprocessingShape" mc:Ignorable="w14 w15 w16se wp14">
+<w:hdr xmlns:wpc="http://schemas.microsoft.com/office/word/2010/wordprocessingCanvas" xmlns:cx="http://schemas.microsoft.com/office/drawing/2014/chartex" xmlns:cx1="http://schemas.microsoft.com/office/drawing/2015/9/8/chartex" xmlns:cx2="http://schemas.microsoft.com/office/drawing/2015/10/21/chartex" xmlns:cx3="http://schemas.microsoft.com/office/drawing/2016/5/9/chartex" xmlns:cx4="http://schemas.microsoft.com/office/drawing/2016/5/10/chartex" xmlns:cx5="http://schemas.microsoft.com/office/drawing/2016/5/11/chartex" xmlns:cx6="http://schemas.microsoft.com/office/drawing/2016/5/12/chartex" xmlns:cx7="http://schemas.microsoft.com/office/drawing/2016/5/13/chartex" xmlns:cx8="http://schemas.microsoft.com/office/drawing/2016/5/14/chartex" xmlns:mc="http://schemas.openxmlformats.org/markup-compatibility/2006" xmlns:aink="http://schemas.microsoft.com/office/drawing/2016/ink" xmlns:am3d="http://schemas.microsoft.com/office/drawing/2017/model3d" xmlns:o="urn:schemas-microsoft-com:office:office" xmlns:oel="http://schemas.microsoft.com/office/2019/extlst" xmlns:r="http://schemas.openxmlformats.org/officeDocument/2006/relationships" xmlns:m="http://schemas.openxmlformats.org/officeDocument/2006/math" xmlns:v="urn:schemas-microsoft-com:vml" xmlns:wp14="http://schemas.microsoft.com/office/word/2010/wordprocessingDrawing" xmlns:wp="http://schemas.openxmlformats.org/drawingml/2006/wordprocessingDrawing" xmlns:w10="urn:schemas-microsoft-com:office:word" xmlns:w="http://schemas.openxmlformats.org/wordprocessingml/2006/main" xmlns:w14="http://schemas.microsoft.com/office/word/2010/wordml" xmlns:w15="http://schemas.microsoft.com/office/word/2012/wordml" xmlns:w16cex="http://schemas.microsoft.com/office/word/2018/wordml/cex" xmlns:w16cid="http://schemas.microsoft.com/office/word/2016/wordml/cid" xmlns:w16="http://schemas.microsoft.com/office/word/2018/wordml" xmlns:w16du="http://schemas.microsoft.com/office/word/2023/wordml/word16du" xmlns:w16sdtdh="http://schemas.microsoft.com/office/word/2020/wordml/sdtdatahash" xmlns:w16sdtfl="http://schemas.microsoft.com/office/word/2024/wordml/sdtformatlock" xmlns:w16se="http://schemas.microsoft.com/office/word/2015/wordml/symex" xmlns:wpg="http://schemas.microsoft.com/office/word/2010/wordprocessingGroup" xmlns:wpi="http://schemas.microsoft.com/office/word/2010/wordprocessingInk" xmlns:wne="http://schemas.microsoft.com/office/word/2006/wordml" xmlns:wps="http://schemas.microsoft.com/office/word/2010/wordprocessingShape" mc:Ignorable="w14 w15 w16se w16cid w16 w16cex w16sdtdh w16sdtfl w16du wp14">
+  <w:p>
+    <w:pPr>
+      <w:pStyle w:val="Header"/>
+    </w:pPr>
+  </w:p>
+</w:hdr>
+</file>
+
+<file path=word/header2.xml><?xml version="1.0" encoding="utf-8"?>
+<w:hdr xmlns:wpc="http://schemas.microsoft.com/office/word/2010/wordprocessingCanvas" xmlns:cx="http://schemas.microsoft.com/office/drawing/2014/chartex" xmlns:cx1="http://schemas.microsoft.com/office/drawing/2015/9/8/chartex" xmlns:cx2="http://schemas.microsoft.com/office/drawing/2015/10/21/chartex" xmlns:cx3="http://schemas.microsoft.com/office/drawing/2016/5/9/chartex" xmlns:cx4="http://schemas.microsoft.com/office/drawing/2016/5/10/chartex" xmlns:cx5="http://schemas.microsoft.com/office/drawing/2016/5/11/chartex" xmlns:cx6="http://schemas.microsoft.com/office/drawing/2016/5/12/chartex" xmlns:cx7="http://schemas.microsoft.com/office/drawing/2016/5/13/chartex" xmlns:cx8="http://schemas.microsoft.com/office/drawing/2016/5/14/chartex" xmlns:mc="http://schemas.openxmlformats.org/markup-compatibility/2006" xmlns:aink="http://schemas.microsoft.com/office/drawing/2016/ink" xmlns:am3d="http://schemas.microsoft.com/office/drawing/2017/model3d" xmlns:o="urn:schemas-microsoft-com:office:office" xmlns:oel="http://schemas.microsoft.com/office/2019/extlst" xmlns:r="http://schemas.openxmlformats.org/officeDocument/2006/relationships" xmlns:m="http://schemas.openxmlformats.org/officeDocument/2006/math" xmlns:v="urn:schemas-microsoft-com:vml" xmlns:wp14="http://schemas.microsoft.com/office/word/2010/wordprocessingDrawing" xmlns:wp="http://schemas.openxmlformats.org/drawingml/2006/wordprocessingDrawing" xmlns:w10="urn:schemas-microsoft-com:office:word" xmlns:w="http://schemas.openxmlformats.org/wordprocessingml/2006/main" xmlns:w14="http://schemas.microsoft.com/office/word/2010/wordml" xmlns:w15="http://schemas.microsoft.com/office/word/2012/wordml" xmlns:w16cex="http://schemas.microsoft.com/office/word/2018/wordml/cex" xmlns:w16cid="http://schemas.microsoft.com/office/word/2016/wordml/cid" xmlns:w16="http://schemas.microsoft.com/office/word/2018/wordml" xmlns:w16du="http://schemas.microsoft.com/office/word/2023/wordml/word16du" xmlns:w16sdtdh="http://schemas.microsoft.com/office/word/2020/wordml/sdtdatahash" xmlns:w16sdtfl="http://schemas.microsoft.com/office/word/2024/wordml/sdtformatlock" xmlns:w16se="http://schemas.microsoft.com/office/word/2015/wordml/symex" xmlns:wpg="http://schemas.microsoft.com/office/word/2010/wordprocessingGroup" xmlns:wpi="http://schemas.microsoft.com/office/word/2010/wordprocessingInk" xmlns:wne="http://schemas.microsoft.com/office/word/2006/wordml" xmlns:wps="http://schemas.microsoft.com/office/word/2010/wordprocessingShape" mc:Ignorable="w14 w15 w16se w16cid w16 w16cex w16sdtdh w16sdtfl w16du wp14">
   <w:tbl>
     <w:tblPr>
       <w:tblStyle w:val="TableGrid"/>
@@ -4997,8 +6846,18 @@
 </w:hdr>
 </file>
 
+<file path=word/header3.xml><?xml version="1.0" encoding="utf-8"?>
+<w:hdr xmlns:wpc="http://schemas.microsoft.com/office/word/2010/wordprocessingCanvas" xmlns:cx="http://schemas.microsoft.com/office/drawing/2014/chartex" xmlns:cx1="http://schemas.microsoft.com/office/drawing/2015/9/8/chartex" xmlns:cx2="http://schemas.microsoft.com/office/drawing/2015/10/21/chartex" xmlns:cx3="http://schemas.microsoft.com/office/drawing/2016/5/9/chartex" xmlns:cx4="http://schemas.microsoft.com/office/drawing/2016/5/10/chartex" xmlns:cx5="http://schemas.microsoft.com/office/drawing/2016/5/11/chartex" xmlns:cx6="http://schemas.microsoft.com/office/drawing/2016/5/12/chartex" xmlns:cx7="http://schemas.microsoft.com/office/drawing/2016/5/13/chartex" xmlns:cx8="http://schemas.microsoft.com/office/drawing/2016/5/14/chartex" xmlns:mc="http://schemas.openxmlformats.org/markup-compatibility/2006" xmlns:aink="http://schemas.microsoft.com/office/drawing/2016/ink" xmlns:am3d="http://schemas.microsoft.com/office/drawing/2017/model3d" xmlns:o="urn:schemas-microsoft-com:office:office" xmlns:oel="http://schemas.microsoft.com/office/2019/extlst" xmlns:r="http://schemas.openxmlformats.org/officeDocument/2006/relationships" xmlns:m="http://schemas.openxmlformats.org/officeDocument/2006/math" xmlns:v="urn:schemas-microsoft-com:vml" xmlns:wp14="http://schemas.microsoft.com/office/word/2010/wordprocessingDrawing" xmlns:wp="http://schemas.openxmlformats.org/drawingml/2006/wordprocessingDrawing" xmlns:w10="urn:schemas-microsoft-com:office:word" xmlns:w="http://schemas.openxmlformats.org/wordprocessingml/2006/main" xmlns:w14="http://schemas.microsoft.com/office/word/2010/wordml" xmlns:w15="http://schemas.microsoft.com/office/word/2012/wordml" xmlns:w16cex="http://schemas.microsoft.com/office/word/2018/wordml/cex" xmlns:w16cid="http://schemas.microsoft.com/office/word/2016/wordml/cid" xmlns:w16="http://schemas.microsoft.com/office/word/2018/wordml" xmlns:w16du="http://schemas.microsoft.com/office/word/2023/wordml/word16du" xmlns:w16sdtdh="http://schemas.microsoft.com/office/word/2020/wordml/sdtdatahash" xmlns:w16sdtfl="http://schemas.microsoft.com/office/word/2024/wordml/sdtformatlock" xmlns:w16se="http://schemas.microsoft.com/office/word/2015/wordml/symex" xmlns:wpg="http://schemas.microsoft.com/office/word/2010/wordprocessingGroup" xmlns:wpi="http://schemas.microsoft.com/office/word/2010/wordprocessingInk" xmlns:wne="http://schemas.microsoft.com/office/word/2006/wordml" xmlns:wps="http://schemas.microsoft.com/office/word/2010/wordprocessingShape" mc:Ignorable="w14 w15 w16se w16cid w16 w16cex w16sdtdh w16sdtfl w16du wp14">
+  <w:p>
+    <w:pPr>
+      <w:pStyle w:val="Header"/>
+    </w:pPr>
+  </w:p>
+</w:hdr>
+</file>
+
 <file path=word/numbering.xml><?xml version="1.0" encoding="utf-8"?>
-<w:numbering xmlns:wpc="http://schemas.microsoft.com/office/word/2010/wordprocessingCanvas" xmlns:cx="http://schemas.microsoft.com/office/drawing/2014/chartex" xmlns:mc="http://schemas.openxmlformats.org/markup-compatibility/2006" xmlns:o="urn:schemas-microsoft-com:office:office" xmlns:r="http://schemas.openxmlformats.org/officeDocument/2006/relationships" xmlns:m="http://schemas.openxmlformats.org/officeDocument/2006/math" xmlns:v="urn:schemas-microsoft-com:vml" xmlns:wp14="http://schemas.microsoft.com/office/word/2010/wordprocessingDrawing" xmlns:wp="http://schemas.openxmlformats.org/drawingml/2006/wordprocessingDrawing" xmlns:w10="urn:schemas-microsoft-com:office:word" xmlns:w="http://schemas.openxmlformats.org/wordprocessingml/2006/main" xmlns:w14="http://schemas.microsoft.com/office/word/2010/wordml" xmlns:w15="http://schemas.microsoft.com/office/word/2012/wordml" xmlns:w16se="http://schemas.microsoft.com/office/word/2015/wordml/symex" xmlns:wpg="http://schemas.microsoft.com/office/word/2010/wordprocessingGroup" xmlns:wpi="http://schemas.microsoft.com/office/word/2010/wordprocessingInk" xmlns:wne="http://schemas.microsoft.com/office/word/2006/wordml" xmlns:wps="http://schemas.microsoft.com/office/word/2010/wordprocessingShape" mc:Ignorable="w14 w15 w16se wp14">
+<w:numbering xmlns:wpc="http://schemas.microsoft.com/office/word/2010/wordprocessingCanvas" xmlns:cx="http://schemas.microsoft.com/office/drawing/2014/chartex" xmlns:cx1="http://schemas.microsoft.com/office/drawing/2015/9/8/chartex" xmlns:cx2="http://schemas.microsoft.com/office/drawing/2015/10/21/chartex" xmlns:cx3="http://schemas.microsoft.com/office/drawing/2016/5/9/chartex" xmlns:cx4="http://schemas.microsoft.com/office/drawing/2016/5/10/chartex" xmlns:cx5="http://schemas.microsoft.com/office/drawing/2016/5/11/chartex" xmlns:cx6="http://schemas.microsoft.com/office/drawing/2016/5/12/chartex" xmlns:cx7="http://schemas.microsoft.com/office/drawing/2016/5/13/chartex" xmlns:cx8="http://schemas.microsoft.com/office/drawing/2016/5/14/chartex" xmlns:mc="http://schemas.openxmlformats.org/markup-compatibility/2006" xmlns:aink="http://schemas.microsoft.com/office/drawing/2016/ink" xmlns:am3d="http://schemas.microsoft.com/office/drawing/2017/model3d" xmlns:o="urn:schemas-microsoft-com:office:office" xmlns:oel="http://schemas.microsoft.com/office/2019/extlst" xmlns:r="http://schemas.openxmlformats.org/officeDocument/2006/relationships" xmlns:m="http://schemas.openxmlformats.org/officeDocument/2006/math" xmlns:v="urn:schemas-microsoft-com:vml" xmlns:wp14="http://schemas.microsoft.com/office/word/2010/wordprocessingDrawing" xmlns:wp="http://schemas.openxmlformats.org/drawingml/2006/wordprocessingDrawing" xmlns:w10="urn:schemas-microsoft-com:office:word" xmlns:w="http://schemas.openxmlformats.org/wordprocessingml/2006/main" xmlns:w14="http://schemas.microsoft.com/office/word/2010/wordml" xmlns:w15="http://schemas.microsoft.com/office/word/2012/wordml" xmlns:w16cex="http://schemas.microsoft.com/office/word/2018/wordml/cex" xmlns:w16cid="http://schemas.microsoft.com/office/word/2016/wordml/cid" xmlns:w16="http://schemas.microsoft.com/office/word/2018/wordml" xmlns:w16du="http://schemas.microsoft.com/office/word/2023/wordml/word16du" xmlns:w16sdtdh="http://schemas.microsoft.com/office/word/2020/wordml/sdtdatahash" xmlns:w16sdtfl="http://schemas.microsoft.com/office/word/2024/wordml/sdtformatlock" xmlns:w16se="http://schemas.microsoft.com/office/word/2015/wordml/symex" xmlns:wpg="http://schemas.microsoft.com/office/word/2010/wordprocessingGroup" xmlns:wpi="http://schemas.microsoft.com/office/word/2010/wordprocessingInk" xmlns:wne="http://schemas.microsoft.com/office/word/2006/wordml" xmlns:wps="http://schemas.microsoft.com/office/word/2010/wordprocessingShape" mc:Ignorable="w14 w15 w16se w16cid w16 w16cex w16sdtdh w16sdtfl w16du wp14">
   <w:abstractNum w:abstractNumId="0" w15:restartNumberingAfterBreak="0">
     <w:nsid w:val="0993702F"/>
     <w:multiLevelType w:val="hybridMultilevel"/>
@@ -5339,6 +7198,119 @@
     </w:lvl>
   </w:abstractNum>
   <w:abstractNum w:abstractNumId="3" w15:restartNumberingAfterBreak="0">
+    <w:nsid w:val="3F0F6404"/>
+    <w:multiLevelType w:val="hybridMultilevel"/>
+    <w:tmpl w:val="80D84710"/>
+    <w:lvl w:ilvl="0" w:tplc="20000001">
+      <w:start w:val="1"/>
+      <w:numFmt w:val="bullet"/>
+      <w:lvlText w:val=""/>
+      <w:lvlJc w:val="left"/>
+      <w:pPr>
+        <w:ind w:left="1080" w:hanging="360"/>
+      </w:pPr>
+      <w:rPr>
+        <w:rFonts w:ascii="Symbol" w:hAnsi="Symbol" w:hint="default"/>
+      </w:rPr>
+    </w:lvl>
+    <w:lvl w:ilvl="1" w:tplc="20000003" w:tentative="1">
+      <w:start w:val="1"/>
+      <w:numFmt w:val="bullet"/>
+      <w:lvlText w:val="o"/>
+      <w:lvlJc w:val="left"/>
+      <w:pPr>
+        <w:ind w:left="1800" w:hanging="360"/>
+      </w:pPr>
+      <w:rPr>
+        <w:rFonts w:ascii="Courier New" w:hAnsi="Courier New" w:cs="Courier New" w:hint="default"/>
+      </w:rPr>
+    </w:lvl>
+    <w:lvl w:ilvl="2" w:tplc="20000005" w:tentative="1">
+      <w:start w:val="1"/>
+      <w:numFmt w:val="bullet"/>
+      <w:lvlText w:val=""/>
+      <w:lvlJc w:val="left"/>
+      <w:pPr>
+        <w:ind w:left="2520" w:hanging="360"/>
+      </w:pPr>
+      <w:rPr>
+        <w:rFonts w:ascii="Wingdings" w:hAnsi="Wingdings" w:hint="default"/>
+      </w:rPr>
+    </w:lvl>
+    <w:lvl w:ilvl="3" w:tplc="20000001" w:tentative="1">
+      <w:start w:val="1"/>
+      <w:numFmt w:val="bullet"/>
+      <w:lvlText w:val=""/>
+      <w:lvlJc w:val="left"/>
+      <w:pPr>
+        <w:ind w:left="3240" w:hanging="360"/>
+      </w:pPr>
+      <w:rPr>
+        <w:rFonts w:ascii="Symbol" w:hAnsi="Symbol" w:hint="default"/>
+      </w:rPr>
+    </w:lvl>
+    <w:lvl w:ilvl="4" w:tplc="20000003" w:tentative="1">
+      <w:start w:val="1"/>
+      <w:numFmt w:val="bullet"/>
+      <w:lvlText w:val="o"/>
+      <w:lvlJc w:val="left"/>
+      <w:pPr>
+        <w:ind w:left="3960" w:hanging="360"/>
+      </w:pPr>
+      <w:rPr>
+        <w:rFonts w:ascii="Courier New" w:hAnsi="Courier New" w:cs="Courier New" w:hint="default"/>
+      </w:rPr>
+    </w:lvl>
+    <w:lvl w:ilvl="5" w:tplc="20000005" w:tentative="1">
+      <w:start w:val="1"/>
+      <w:numFmt w:val="bullet"/>
+      <w:lvlText w:val=""/>
+      <w:lvlJc w:val="left"/>
+      <w:pPr>
+        <w:ind w:left="4680" w:hanging="360"/>
+      </w:pPr>
+      <w:rPr>
+        <w:rFonts w:ascii="Wingdings" w:hAnsi="Wingdings" w:hint="default"/>
+      </w:rPr>
+    </w:lvl>
+    <w:lvl w:ilvl="6" w:tplc="20000001" w:tentative="1">
+      <w:start w:val="1"/>
+      <w:numFmt w:val="bullet"/>
+      <w:lvlText w:val=""/>
+      <w:lvlJc w:val="left"/>
+      <w:pPr>
+        <w:ind w:left="5400" w:hanging="360"/>
+      </w:pPr>
+      <w:rPr>
+        <w:rFonts w:ascii="Symbol" w:hAnsi="Symbol" w:hint="default"/>
+      </w:rPr>
+    </w:lvl>
+    <w:lvl w:ilvl="7" w:tplc="20000003" w:tentative="1">
+      <w:start w:val="1"/>
+      <w:numFmt w:val="bullet"/>
+      <w:lvlText w:val="o"/>
+      <w:lvlJc w:val="left"/>
+      <w:pPr>
+        <w:ind w:left="6120" w:hanging="360"/>
+      </w:pPr>
+      <w:rPr>
+        <w:rFonts w:ascii="Courier New" w:hAnsi="Courier New" w:cs="Courier New" w:hint="default"/>
+      </w:rPr>
+    </w:lvl>
+    <w:lvl w:ilvl="8" w:tplc="20000005" w:tentative="1">
+      <w:start w:val="1"/>
+      <w:numFmt w:val="bullet"/>
+      <w:lvlText w:val=""/>
+      <w:lvlJc w:val="left"/>
+      <w:pPr>
+        <w:ind w:left="6840" w:hanging="360"/>
+      </w:pPr>
+      <w:rPr>
+        <w:rFonts w:ascii="Wingdings" w:hAnsi="Wingdings" w:hint="default"/>
+      </w:rPr>
+    </w:lvl>
+  </w:abstractNum>
+  <w:abstractNum w:abstractNumId="4" w15:restartNumberingAfterBreak="0">
     <w:nsid w:val="5ABA4CE0"/>
     <w:multiLevelType w:val="hybridMultilevel"/>
     <w:tmpl w:val="CDFCC4AC"/>
@@ -5451,7 +7423,7 @@
       </w:rPr>
     </w:lvl>
   </w:abstractNum>
-  <w:abstractNum w:abstractNumId="4" w15:restartNumberingAfterBreak="0">
+  <w:abstractNum w:abstractNumId="5" w15:restartNumberingAfterBreak="0">
     <w:nsid w:val="6D28666D"/>
     <w:multiLevelType w:val="hybridMultilevel"/>
     <w:tmpl w:val="4CC82DB6"/>
@@ -5564,7 +7536,7 @@
       </w:rPr>
     </w:lvl>
   </w:abstractNum>
-  <w:abstractNum w:abstractNumId="5" w15:restartNumberingAfterBreak="0">
+  <w:abstractNum w:abstractNumId="6" w15:restartNumberingAfterBreak="0">
     <w:nsid w:val="7F6C3464"/>
     <w:multiLevelType w:val="hybridMultilevel"/>
     <w:tmpl w:val="3CF26226"/>
@@ -5677,29 +7649,32 @@
       </w:rPr>
     </w:lvl>
   </w:abstractNum>
-  <w:num w:numId="1">
-    <w:abstractNumId w:val="3"/>
+  <w:num w:numId="1" w16cid:durableId="658313088">
+    <w:abstractNumId w:val="4"/>
   </w:num>
-  <w:num w:numId="2">
+  <w:num w:numId="2" w16cid:durableId="1506631302">
     <w:abstractNumId w:val="2"/>
   </w:num>
-  <w:num w:numId="3">
+  <w:num w:numId="3" w16cid:durableId="973482427">
+    <w:abstractNumId w:val="6"/>
+  </w:num>
+  <w:num w:numId="4" w16cid:durableId="457145457">
     <w:abstractNumId w:val="5"/>
   </w:num>
-  <w:num w:numId="4">
-    <w:abstractNumId w:val="4"/>
-  </w:num>
-  <w:num w:numId="5">
+  <w:num w:numId="5" w16cid:durableId="357462800">
     <w:abstractNumId w:val="1"/>
   </w:num>
-  <w:num w:numId="6">
+  <w:num w:numId="6" w16cid:durableId="1436167072">
     <w:abstractNumId w:val="0"/>
+  </w:num>
+  <w:num w:numId="7" w16cid:durableId="946616701">
+    <w:abstractNumId w:val="3"/>
   </w:num>
 </w:numbering>
 </file>
 
 <file path=word/styles.xml><?xml version="1.0" encoding="utf-8"?>
-<w:styles xmlns:mc="http://schemas.openxmlformats.org/markup-compatibility/2006" xmlns:r="http://schemas.openxmlformats.org/officeDocument/2006/relationships" xmlns:w="http://schemas.openxmlformats.org/wordprocessingml/2006/main" xmlns:w14="http://schemas.microsoft.com/office/word/2010/wordml" xmlns:w15="http://schemas.microsoft.com/office/word/2012/wordml" xmlns:w16se="http://schemas.microsoft.com/office/word/2015/wordml/symex" mc:Ignorable="w14 w15 w16se">
+<w:styles xmlns:mc="http://schemas.openxmlformats.org/markup-compatibility/2006" xmlns:r="http://schemas.openxmlformats.org/officeDocument/2006/relationships" xmlns:w="http://schemas.openxmlformats.org/wordprocessingml/2006/main" xmlns:w14="http://schemas.microsoft.com/office/word/2010/wordml" xmlns:w15="http://schemas.microsoft.com/office/word/2012/wordml" xmlns:w16cex="http://schemas.microsoft.com/office/word/2018/wordml/cex" xmlns:w16cid="http://schemas.microsoft.com/office/word/2016/wordml/cid" xmlns:w16="http://schemas.microsoft.com/office/word/2018/wordml" xmlns:w16du="http://schemas.microsoft.com/office/word/2023/wordml/word16du" xmlns:w16sdtdh="http://schemas.microsoft.com/office/word/2020/wordml/sdtdatahash" xmlns:w16sdtfl="http://schemas.microsoft.com/office/word/2024/wordml/sdtformatlock" xmlns:w16se="http://schemas.microsoft.com/office/word/2015/wordml/symex" mc:Ignorable="w14 w15 w16se w16cid w16 w16cex w16sdtdh w16sdtfl w16du">
   <w:docDefaults>
     <w:rPrDefault>
       <w:rPr>
@@ -5717,7 +7692,7 @@
       </w:pPr>
     </w:pPrDefault>
   </w:docDefaults>
-  <w:latentStyles w:defLockedState="0" w:defUIPriority="99" w:defSemiHidden="0" w:defUnhideWhenUsed="0" w:defQFormat="0" w:count="371">
+  <w:latentStyles w:defLockedState="0" w:defUIPriority="99" w:defSemiHidden="0" w:defUnhideWhenUsed="0" w:defQFormat="0" w:count="376">
     <w:lsdException w:name="Normal" w:uiPriority="0" w:qFormat="1"/>
     <w:lsdException w:name="heading 1" w:uiPriority="9" w:qFormat="1"/>
     <w:lsdException w:name="heading 2" w:semiHidden="1" w:uiPriority="9" w:unhideWhenUsed="1" w:qFormat="1"/>
@@ -6089,6 +8064,11 @@
     <w:lsdException w:name="List Table 5 Dark Accent 6" w:uiPriority="50"/>
     <w:lsdException w:name="List Table 6 Colorful Accent 6" w:uiPriority="51"/>
     <w:lsdException w:name="List Table 7 Colorful Accent 6" w:uiPriority="52"/>
+    <w:lsdException w:name="Mention" w:semiHidden="1" w:unhideWhenUsed="1"/>
+    <w:lsdException w:name="Smart Hyperlink" w:semiHidden="1" w:unhideWhenUsed="1"/>
+    <w:lsdException w:name="Hashtag" w:semiHidden="1" w:unhideWhenUsed="1"/>
+    <w:lsdException w:name="Unresolved Mention" w:semiHidden="1" w:unhideWhenUsed="1"/>
+    <w:lsdException w:name="Smart Link" w:semiHidden="1" w:unhideWhenUsed="1"/>
   </w:latentStyles>
   <w:style w:type="paragraph" w:default="1" w:styleId="Normal">
     <w:name w:val="Normal"/>
@@ -6118,7 +8098,6 @@
   <w:style w:type="character" w:default="1" w:styleId="DefaultParagraphFont">
     <w:name w:val="Default Paragraph Font"/>
     <w:uiPriority w:val="1"/>
-    <w:semiHidden/>
     <w:unhideWhenUsed/>
   </w:style>
   <w:style w:type="table" w:default="1" w:styleId="TableNormal">
@@ -6262,6 +8241,70 @@
         <w:insideV w:val="single" w:sz="4" w:space="0" w:color="auto"/>
       </w:tblBorders>
     </w:tblPr>
+  </w:style>
+  <w:style w:type="paragraph" w:styleId="TOCHeading">
+    <w:name w:val="TOC Heading"/>
+    <w:basedOn w:val="Heading1"/>
+    <w:next w:val="Normal"/>
+    <w:uiPriority w:val="39"/>
+    <w:unhideWhenUsed/>
+    <w:qFormat/>
+    <w:rsid w:val="000E4128"/>
+    <w:pPr>
+      <w:outlineLvl w:val="9"/>
+    </w:pPr>
+    <w:rPr>
+      <w:kern w:val="0"/>
+      <w14:ligatures w14:val="none"/>
+    </w:rPr>
+  </w:style>
+  <w:style w:type="paragraph" w:styleId="TOC1">
+    <w:name w:val="toc 1"/>
+    <w:basedOn w:val="Normal"/>
+    <w:next w:val="Normal"/>
+    <w:autoRedefine/>
+    <w:uiPriority w:val="39"/>
+    <w:unhideWhenUsed/>
+    <w:rsid w:val="000E4128"/>
+    <w:pPr>
+      <w:spacing w:after="100"/>
+    </w:pPr>
+    <w:rPr>
+      <w:b/>
+      <w:color w:val="0070C0"/>
+      <w:kern w:val="0"/>
+      <w:lang w:val="en-IE"/>
+      <w14:ligatures w14:val="none"/>
+    </w:rPr>
+  </w:style>
+  <w:style w:type="character" w:styleId="Hyperlink">
+    <w:name w:val="Hyperlink"/>
+    <w:basedOn w:val="DefaultParagraphFont"/>
+    <w:uiPriority w:val="99"/>
+    <w:unhideWhenUsed/>
+    <w:rsid w:val="000E4128"/>
+    <w:rPr>
+      <w:color w:val="0563C1" w:themeColor="hyperlink"/>
+      <w:u w:val="single"/>
+    </w:rPr>
+  </w:style>
+  <w:style w:type="paragraph" w:styleId="TOC2">
+    <w:name w:val="toc 2"/>
+    <w:basedOn w:val="Normal"/>
+    <w:next w:val="Normal"/>
+    <w:autoRedefine/>
+    <w:uiPriority w:val="39"/>
+    <w:unhideWhenUsed/>
+    <w:rsid w:val="000E4128"/>
+    <w:pPr>
+      <w:spacing w:after="100"/>
+      <w:ind w:left="220"/>
+    </w:pPr>
+    <w:rPr>
+      <w:kern w:val="0"/>
+      <w:lang w:val="en-IE"/>
+      <w14:ligatures w14:val="none"/>
+    </w:rPr>
   </w:style>
 </w:styles>
 </file>
@@ -6525,4 +8568,10 @@
     </a:ext>
   </a:extLst>
 </a:theme>
+</file>
+
+<file path=docMetadata/LabelInfo.xml><?xml version="1.0" encoding="utf-8"?>
+<clbl:labelList xmlns:clbl="http://schemas.microsoft.com/office/2020/mipLabelMetadata">
+  <clbl:label id="{619ffa58-9d1c-42f8-b0e6-79cea428c945}" enabled="1" method="Privileged" siteId="{8b87af7d-8647-4dc7-8df4-5f69a2011bb5}" contentBits="0" removed="0"/>
+</clbl:labelList>
 </file>
</xml_diff>